<commit_message>
toevoegingen sterschema en organisatie
</commit_message>
<xml_diff>
--- a/DE_Herkansing_Knelpunt2_4.docx
+++ b/DE_Herkansing_Knelpunt2_4.docx
@@ -1729,7 +1729,7 @@
           <w:sz w:val="24"/>
           <w:szCs w:val="24"/>
         </w:rPr>
-        <w:t xml:space="preserve">Voor de twee knelpunten zijn twee sterschema's toegevoegd aan het bestaande datawarehouse (GO_DWH.db). Bestaande dimensies (DIM_DATE, DIM_PRODUCT, DIM_RETAILER, DIM_STAFF) worden hergebruikt; er zijn drie nieuwe dimensies en drie nieuwe feiten. Onderstaand diagram toont het uitgebreide sterschema; de nieuwe tabellen zijn met kleur gemarkeerd.</w:t>
+        <w:t xml:space="preserve">Voor de twee knelpunten zijn twee sterschema's toegevoegd aan het bestaande datawarehouse (GO_DWH.db). Onderstaand geïntegreerd diagram toont het volledige sterschema: de bestaande feiten (FACT_ORDER, FACT_INVENTORY, FACT_SALES_TARGET) en dimensies, plus de drie nieuwe feiten en drie nieuwe dimensies van deze herkansing. De nieuwe tabellen zijn met kleur (groen = nieuwe dimensie, roze = nieuw feit) en dikkere randen gemarkeerd; de bestaande dimensies DIM_DATE, DIM_PRODUCT, DIM_RETAILER en DIM_STAFF worden hergebruikt.</w:t>
       </w:r>
     </w:p>
     <w:p>
@@ -1740,7 +1740,7 @@
       <w:r>
         <w:drawing>
           <wp:inline distT="0" distB="0" distL="0" distR="0">
-            <wp:extent cx="5943600" cy="4629150"/>
+            <wp:extent cx="6096000" cy="5438775"/>
             <wp:effectExtent t="0" r="0" b="0" l="0"/>
             <wp:docPr id="1" name="" descr="" title=""/>
             <wp:cNvGraphicFramePr>
@@ -1765,7 +1765,7 @@
                   <pic:spPr bwMode="auto">
                     <a:xfrm>
                       <a:off x="0" y="0"/>
-                      <a:ext cx="5943600" cy="4629150"/>
+                      <a:ext cx="6096000" cy="5438775"/>
                     </a:xfrm>
                     <a:prstGeom prst="rect">
                       <a:avLst/>
@@ -1791,7 +1791,7 @@
           <w:sz w:val="24"/>
           <w:szCs w:val="24"/>
         </w:rPr>
-        <w:t xml:space="preserve">Figuur 1 – Uitgebreid sterschema met de nieuwe feiten en dimensies</w:t>
+        <w:t xml:space="preserve">Figuur 1 – Geïntegreerd sterschema: bestaand project + nieuwe feiten en dimensies (herkansing)</w:t>
       </w:r>
     </w:p>
     <w:p>
@@ -1806,7 +1806,7 @@
           <w:sz w:val="24"/>
           <w:szCs w:val="24"/>
         </w:rPr>
-        <w:t xml:space="preserve">4.1 Sterschema Retouren</w:t>
+        <w:t xml:space="preserve">4.1 Samenvoegen van SDM-klassen (horizontaal en verticaal)</w:t>
       </w:r>
     </w:p>
     <w:p>
@@ -1816,20 +1816,10 @@
       <w:r>
         <w:rPr>
           <w:rFonts w:ascii="Arial" w:cs="Arial" w:eastAsia="Arial" w:hAnsi="Arial"/>
-          <w:b/>
-          <w:bCs/>
-          <w:sz w:val="24"/>
-          <w:szCs w:val="24"/>
-        </w:rPr>
-        <w:t xml:space="preserve">Feit fact_returns </w:t>
-      </w:r>
-      <w:r>
-        <w:rPr>
-          <w:rFonts w:ascii="Arial" w:cs="Arial" w:eastAsia="Arial" w:hAnsi="Arial"/>
-          <w:sz w:val="24"/>
-          <w:szCs w:val="24"/>
-        </w:rPr>
-        <w:t xml:space="preserve">(granulariteit: één geretourneerde orderregel). Sleutels naar: dim_date, dim_product, dim_customer (retailer), dim_region, dim_sales_staff en de nieuwe dimensie dim_return_reason. Meetwaarden:</w:t>
+          <w:sz w:val="24"/>
+          <w:szCs w:val="24"/>
+        </w:rPr>
+        <w:t xml:space="preserve">De feiten en dimensies ontstaan door SDM-klassen samen te voegen:</w:t>
       </w:r>
     </w:p>
     <w:p>
@@ -1844,10 +1834,20 @@
       <w:r>
         <w:rPr>
           <w:rFonts w:ascii="Arial" w:cs="Arial" w:eastAsia="Arial" w:hAnsi="Arial"/>
-          <w:sz w:val="24"/>
-          <w:szCs w:val="24"/>
-        </w:rPr>
-        <w:t xml:space="preserve">return_quantity – aantal geretourneerd</w:t>
+          <w:b/>
+          <w:bCs/>
+          <w:sz w:val="24"/>
+          <w:szCs w:val="24"/>
+        </w:rPr>
+        <w:t xml:space="preserve">Horizontaal (join): </w:t>
+      </w:r>
+      <w:r>
+        <w:rPr>
+          <w:rFonts w:ascii="Arial" w:cs="Arial" w:eastAsia="Arial" w:hAnsi="Arial"/>
+          <w:sz w:val="24"/>
+          <w:szCs w:val="24"/>
+        </w:rPr>
+        <w:t xml:space="preserve">returned_item wordt gekoppeld aan order_details/order_header (via fact_order_sales) tot fact_returns; training en satisfaction worden gekoppeld aan sales_representative/sales_staff.</w:t>
       </w:r>
     </w:p>
     <w:p>
@@ -1862,10 +1862,58 @@
       <w:r>
         <w:rPr>
           <w:rFonts w:ascii="Arial" w:cs="Arial" w:eastAsia="Arial" w:hAnsi="Arial"/>
-          <w:sz w:val="24"/>
-          <w:szCs w:val="24"/>
-        </w:rPr>
-        <w:t xml:space="preserve">original_quantity – oorspronkelijk besteld aantal (basis voor retourpercentage)</w:t>
+          <w:b/>
+          <w:bCs/>
+          <w:sz w:val="24"/>
+          <w:szCs w:val="24"/>
+        </w:rPr>
+        <w:t xml:space="preserve">Verticaal (verrijken/afleiden): </w:t>
+      </w:r>
+      <w:r>
+        <w:rPr>
+          <w:rFonts w:ascii="Arial" w:cs="Arial" w:eastAsia="Arial" w:hAnsi="Arial"/>
+          <w:sz w:val="24"/>
+          <w:szCs w:val="24"/>
+        </w:rPr>
+        <w:t xml:space="preserve">return_reason → dim_return_reason met afgeleide categorie; course → dim_course met afgeleide categorie en kosten; satisfaction_type → dim_satisfaction_type met afgeleide score.</w:t>
+      </w:r>
+    </w:p>
+    <w:p>
+      <w:pPr>
+        <w:pStyle w:val="Heading2"/>
+      </w:pPr>
+      <w:r>
+        <w:rPr>
+          <w:rFonts w:ascii="Arial" w:cs="Arial" w:eastAsia="Arial" w:hAnsi="Arial"/>
+          <w:b/>
+          <w:bCs/>
+          <w:sz w:val="24"/>
+          <w:szCs w:val="24"/>
+        </w:rPr>
+        <w:t xml:space="preserve">4.2 Sterschema Retouren</w:t>
+      </w:r>
+    </w:p>
+    <w:p>
+      <w:pPr>
+        <w:spacing w:after="160"/>
+      </w:pPr>
+      <w:r>
+        <w:rPr>
+          <w:rFonts w:ascii="Arial" w:cs="Arial" w:eastAsia="Arial" w:hAnsi="Arial"/>
+          <w:b/>
+          <w:bCs/>
+          <w:sz w:val="24"/>
+          <w:szCs w:val="24"/>
+        </w:rPr>
+        <w:t xml:space="preserve">Feit fact_returns </w:t>
+      </w:r>
+      <w:r>
+        <w:rPr>
+          <w:rFonts w:ascii="Arial" w:cs="Arial" w:eastAsia="Arial" w:hAnsi="Arial"/>
+          <w:sz w:val="24"/>
+          <w:szCs w:val="24"/>
+        </w:rPr>
+        <w:t xml:space="preserve">(granulariteit: één geretourneerde orderregel). Sleutels naar: dim_date, dim_product, dim_customer (retailer), dim_region, dim_sales_staff en de nieuwe dimensie dim_return_reason. Meetwaarden:</w:t>
       </w:r>
     </w:p>
     <w:p>
@@ -1883,7 +1931,7 @@
           <w:sz w:val="24"/>
           <w:szCs w:val="24"/>
         </w:rPr>
-        <w:t xml:space="preserve">return_value (afgeleid) – gederfde omzet = aantal × verkoopprijs</w:t>
+        <w:t xml:space="preserve">return_quantity – aantal geretourneerd</w:t>
       </w:r>
     </w:p>
     <w:p>
@@ -1901,6 +1949,42 @@
           <w:sz w:val="24"/>
           <w:szCs w:val="24"/>
         </w:rPr>
+        <w:t xml:space="preserve">original_quantity – oorspronkelijk besteld aantal (basis voor retourpercentage)</w:t>
+      </w:r>
+    </w:p>
+    <w:p>
+      <w:pPr>
+        <w:pStyle w:val="ListParagraph"/>
+        <w:numPr>
+          <w:ilvl w:val="0"/>
+          <w:numId w:val="2"/>
+        </w:numPr>
+        <w:spacing w:after="80"/>
+      </w:pPr>
+      <w:r>
+        <w:rPr>
+          <w:rFonts w:ascii="Arial" w:cs="Arial" w:eastAsia="Arial" w:hAnsi="Arial"/>
+          <w:sz w:val="24"/>
+          <w:szCs w:val="24"/>
+        </w:rPr>
+        <w:t xml:space="preserve">return_value (afgeleid) – gederfde omzet = aantal × verkoopprijs</w:t>
+      </w:r>
+    </w:p>
+    <w:p>
+      <w:pPr>
+        <w:pStyle w:val="ListParagraph"/>
+        <w:numPr>
+          <w:ilvl w:val="0"/>
+          <w:numId w:val="2"/>
+        </w:numPr>
+        <w:spacing w:after="80"/>
+      </w:pPr>
+      <w:r>
+        <w:rPr>
+          <w:rFonts w:ascii="Arial" w:cs="Arial" w:eastAsia="Arial" w:hAnsi="Arial"/>
+          <w:sz w:val="24"/>
+          <w:szCs w:val="24"/>
+        </w:rPr>
         <w:t xml:space="preserve">gross_loss (afgeleid) – gederfde marge = aantal × (verkoopprijs − kostprijs)</w:t>
       </w:r>
     </w:p>
@@ -1939,7 +2023,7 @@
           <w:sz w:val="24"/>
           <w:szCs w:val="24"/>
         </w:rPr>
-        <w:t xml:space="preserve">4.2 Sterschema Cursussen</w:t>
+        <w:t xml:space="preserve">4.3 Sterschema Cursussen</w:t>
       </w:r>
     </w:p>
     <w:p>
@@ -2023,7 +2107,7 @@
           <w:sz w:val="24"/>
           <w:szCs w:val="24"/>
         </w:rPr>
-        <w:t xml:space="preserve">4.3 Afgeleide attributen en meetwaarden</w:t>
+        <w:t xml:space="preserve">4.4 Afgeleide attributen en meetwaarden</w:t>
       </w:r>
     </w:p>
     <w:p>
@@ -2797,7 +2881,7 @@
           <w:sz w:val="24"/>
           <w:szCs w:val="24"/>
         </w:rPr>
-        <w:t xml:space="preserve">4.4 SCD-keuzes</w:t>
+        <w:t xml:space="preserve">4.5 Granulariteit (omgang met korrelverschillen)</w:t>
       </w:r>
     </w:p>
     <w:p>
@@ -2810,226 +2894,7 @@
           <w:sz w:val="24"/>
           <w:szCs w:val="24"/>
         </w:rPr>
-        <w:t xml:space="preserve">Conform de criteria zijn minimaal twee dimensies als SCD-type 2 geïmplementeerd en de rest als SCD-type 1:</w:t>
-      </w:r>
-    </w:p>
-    <w:p>
-      <w:pPr>
-        <w:pStyle w:val="ListParagraph"/>
-        <w:numPr>
-          <w:ilvl w:val="0"/>
-          <w:numId w:val="2"/>
-        </w:numPr>
-        <w:spacing w:after="80"/>
-      </w:pPr>
-      <w:r>
-        <w:rPr>
-          <w:rFonts w:ascii="Arial" w:cs="Arial" w:eastAsia="Arial" w:hAnsi="Arial"/>
-          <w:b/>
-          <w:bCs/>
-          <w:sz w:val="24"/>
-          <w:szCs w:val="24"/>
-        </w:rPr>
-        <w:t xml:space="preserve">SCD-type 2: </w:t>
-      </w:r>
-      <w:r>
-        <w:rPr>
-          <w:rFonts w:ascii="Arial" w:cs="Arial" w:eastAsia="Arial" w:hAnsi="Arial"/>
-          <w:sz w:val="24"/>
-          <w:szCs w:val="24"/>
-        </w:rPr>
-        <w:t xml:space="preserve">dim_return_reason en dim_course. Bij een wijziging (bv. een aangepaste omschrijving) wordt de oude rij afgesloten (is_current = 0, valid_to gevuld) en een nieuwe versie toegevoegd. Zo blijft de historie bewaard.</w:t>
-      </w:r>
-    </w:p>
-    <w:p>
-      <w:pPr>
-        <w:pStyle w:val="ListParagraph"/>
-        <w:numPr>
-          <w:ilvl w:val="0"/>
-          <w:numId w:val="2"/>
-        </w:numPr>
-        <w:spacing w:after="80"/>
-      </w:pPr>
-      <w:r>
-        <w:rPr>
-          <w:rFonts w:ascii="Arial" w:cs="Arial" w:eastAsia="Arial" w:hAnsi="Arial"/>
-          <w:b/>
-          <w:bCs/>
-          <w:sz w:val="24"/>
-          <w:szCs w:val="24"/>
-        </w:rPr>
-        <w:t xml:space="preserve">SCD-type 1: </w:t>
-      </w:r>
-      <w:r>
-        <w:rPr>
-          <w:rFonts w:ascii="Arial" w:cs="Arial" w:eastAsia="Arial" w:hAnsi="Arial"/>
-          <w:sz w:val="24"/>
-          <w:szCs w:val="24"/>
-        </w:rPr>
-        <w:t xml:space="preserve">dim_satisfaction_type wordt simpelweg overschreven.</w:t>
-      </w:r>
-    </w:p>
-    <w:p>
-      <w:pPr>
-        <w:pStyle w:val="Heading1"/>
-      </w:pPr>
-      <w:r>
-        <w:rPr>
-          <w:rFonts w:ascii="Arial" w:cs="Arial" w:eastAsia="Arial" w:hAnsi="Arial"/>
-          <w:b/>
-          <w:bCs/>
-          <w:sz w:val="24"/>
-          <w:szCs w:val="24"/>
-        </w:rPr>
-        <w:t xml:space="preserve">5. ETL-processen</w:t>
-      </w:r>
-    </w:p>
-    <w:p>
-      <w:pPr>
-        <w:spacing w:after="160"/>
-      </w:pPr>
-      <w:r>
-        <w:rPr>
-          <w:rFonts w:ascii="Arial" w:cs="Arial" w:eastAsia="Arial" w:hAnsi="Arial"/>
-          <w:sz w:val="24"/>
-          <w:szCs w:val="24"/>
-        </w:rPr>
-        <w:t xml:space="preserve">De ETL is geïmplementeerd in de notebook GO_DWH_Retouren_Cursussen_Notebook.ipynb. De notebook volgt dezelfde opzet als de bestaande pijplijn (paden → logging → schema → laden → views → export) en draait met één druk op de knop via de functie run_extra_pipeline().</w:t>
-      </w:r>
-    </w:p>
-    <w:p>
-      <w:pPr>
-        <w:pStyle w:val="ListParagraph"/>
-        <w:numPr>
-          <w:ilvl w:val="0"/>
-          <w:numId w:val="2"/>
-        </w:numPr>
-        <w:spacing w:after="80"/>
-      </w:pPr>
-      <w:r>
-        <w:rPr>
-          <w:rFonts w:ascii="Arial" w:cs="Arial" w:eastAsia="Arial" w:hAnsi="Arial"/>
-          <w:b/>
-          <w:bCs/>
-          <w:sz w:val="24"/>
-          <w:szCs w:val="24"/>
-        </w:rPr>
-        <w:t xml:space="preserve">Extract: </w:t>
-      </w:r>
-      <w:r>
-        <w:rPr>
-          <w:rFonts w:ascii="Arial" w:cs="Arial" w:eastAsia="Arial" w:hAnsi="Arial"/>
-          <w:sz w:val="24"/>
-          <w:szCs w:val="24"/>
-        </w:rPr>
-        <w:t xml:space="preserve">brontabellen worden uit GO_SDM.db gelezen.</w:t>
-      </w:r>
-    </w:p>
-    <w:p>
-      <w:pPr>
-        <w:pStyle w:val="ListParagraph"/>
-        <w:numPr>
-          <w:ilvl w:val="0"/>
-          <w:numId w:val="2"/>
-        </w:numPr>
-        <w:spacing w:after="80"/>
-      </w:pPr>
-      <w:r>
-        <w:rPr>
-          <w:rFonts w:ascii="Arial" w:cs="Arial" w:eastAsia="Arial" w:hAnsi="Arial"/>
-          <w:b/>
-          <w:bCs/>
-          <w:sz w:val="24"/>
-          <w:szCs w:val="24"/>
-        </w:rPr>
-        <w:t xml:space="preserve">Transform: </w:t>
-      </w:r>
-      <w:r>
-        <w:rPr>
-          <w:rFonts w:ascii="Arial" w:cs="Arial" w:eastAsia="Arial" w:hAnsi="Arial"/>
-          <w:sz w:val="24"/>
-          <w:szCs w:val="24"/>
-        </w:rPr>
-        <w:t xml:space="preserve">datums worden omgezet naar date_key (YYYYMMDD), categorieën en kosten worden afgeleid en sleutels worden opgezocht.</w:t>
-      </w:r>
-    </w:p>
-    <w:p>
-      <w:pPr>
-        <w:pStyle w:val="ListParagraph"/>
-        <w:numPr>
-          <w:ilvl w:val="0"/>
-          <w:numId w:val="2"/>
-        </w:numPr>
-        <w:spacing w:after="80"/>
-      </w:pPr>
-      <w:r>
-        <w:rPr>
-          <w:rFonts w:ascii="Arial" w:cs="Arial" w:eastAsia="Arial" w:hAnsi="Arial"/>
-          <w:b/>
-          <w:bCs/>
-          <w:sz w:val="24"/>
-          <w:szCs w:val="24"/>
-        </w:rPr>
-        <w:t xml:space="preserve">Load: </w:t>
-      </w:r>
-      <w:r>
-        <w:rPr>
-          <w:rFonts w:ascii="Arial" w:cs="Arial" w:eastAsia="Arial" w:hAnsi="Arial"/>
-          <w:sz w:val="24"/>
-          <w:szCs w:val="24"/>
-        </w:rPr>
-        <w:t xml:space="preserve">dimensies via SCD-1/SCD-2, feiten via full reload.</w:t>
-      </w:r>
-    </w:p>
-    <w:p>
-      <w:pPr>
-        <w:spacing w:after="160"/>
-      </w:pPr>
-      <w:r>
-        <w:rPr>
-          <w:rFonts w:ascii="Arial" w:cs="Arial" w:eastAsia="Arial" w:hAnsi="Arial"/>
-          <w:b/>
-          <w:bCs/>
-          <w:sz w:val="24"/>
-          <w:szCs w:val="24"/>
-        </w:rPr>
-        <w:t xml:space="preserve">Slimme vereenvoudiging: </w:t>
-      </w:r>
-      <w:r>
-        <w:rPr>
-          <w:rFonts w:ascii="Arial" w:cs="Arial" w:eastAsia="Arial" w:hAnsi="Arial"/>
-          <w:sz w:val="24"/>
-          <w:szCs w:val="24"/>
-        </w:rPr>
-        <w:t xml:space="preserve">de retourregels worden gekoppeld aan de reeds gebouwde feittabel fact_order_sales (op order_detail_code). Daarmee zijn de product-, klant-, regio- en medewerkersleutels én de verkoopprijs direct beschikbaar, zonder die opzoekstappen te herhalen.</w:t>
-      </w:r>
-    </w:p>
-    <w:p>
-      <w:pPr>
-        <w:spacing w:after="160"/>
-      </w:pPr>
-      <w:r>
-        <w:rPr>
-          <w:rFonts w:ascii="Arial" w:cs="Arial" w:eastAsia="Arial" w:hAnsi="Arial"/>
-          <w:sz w:val="24"/>
-          <w:szCs w:val="24"/>
-        </w:rPr>
-        <w:t xml:space="preserve">Retourdatums die nog niet in dim_date stonden (81 datums) worden automatisch toegevoegd. Tijdens de run worden logregels weggeschreven naar logs/go_dwh_extra_etl.log (per stap: tabel, actie, aantal rijen, melding), zodat de pijplijnkwaliteit later in Power BI zichtbaar kan worden gemaakt. De inlaadstrategie voor de feiten is full reload, waardoor nieuwe, gewijzigde én verwijderde brongegevens correct meekomen bij een volgende run (de testprocedure met data ná 1 oktober 2025).</w:t>
-      </w:r>
-    </w:p>
-    <w:p>
-      <w:pPr>
-        <w:pStyle w:val="Heading1"/>
-      </w:pPr>
-      <w:r>
-        <w:rPr>
-          <w:rFonts w:ascii="Arial" w:cs="Arial" w:eastAsia="Arial" w:hAnsi="Arial"/>
-          <w:b/>
-          <w:bCs/>
-          <w:sz w:val="24"/>
-          <w:szCs w:val="24"/>
-        </w:rPr>
-        <w:t xml:space="preserve">6. Feiten- en dimensietabellen</w:t>
+        <w:t xml:space="preserve">De korrel (granulariteit) per feittabel is bewust gekozen en korrelverschillen tussen de SDM-klassen zijn als volgt afgehandeld:</w:t>
       </w:r>
     </w:p>
     <w:tbl>
@@ -3055,7 +2920,7 @@
         </w:trPr>
         <w:tc>
           <w:tcPr>
-            <w:tcW w:type="pct" w:w="40%"/>
+            <w:tcW w:type="pct" w:w="24%"/>
             <w:tcBorders>
               <w:top w:val="single" w:color="000000" w:sz="4"/>
               <w:left w:val="single" w:color="000000" w:sz="4"/>
@@ -3078,13 +2943,13 @@
                 <w:sz w:val="24"/>
                 <w:szCs w:val="24"/>
               </w:rPr>
-              <w:t xml:space="preserve">Tabel</w:t>
-            </w:r>
-          </w:p>
-        </w:tc>
-        <w:tc>
-          <w:tcPr>
-            <w:tcW w:type="pct" w:w="40%"/>
+              <w:t xml:space="preserve">Feit</w:t>
+            </w:r>
+          </w:p>
+        </w:tc>
+        <w:tc>
+          <w:tcPr>
+            <w:tcW w:type="pct" w:w="30%"/>
             <w:tcBorders>
               <w:top w:val="single" w:color="000000" w:sz="4"/>
               <w:left w:val="single" w:color="000000" w:sz="4"/>
@@ -3107,13 +2972,13 @@
                 <w:sz w:val="24"/>
                 <w:szCs w:val="24"/>
               </w:rPr>
-              <w:t xml:space="preserve">Soort</w:t>
-            </w:r>
-          </w:p>
-        </w:tc>
-        <w:tc>
-          <w:tcPr>
-            <w:tcW w:type="pct" w:w="20%"/>
+              <w:t xml:space="preserve">Granulariteit (korrel)</w:t>
+            </w:r>
+          </w:p>
+        </w:tc>
+        <w:tc>
+          <w:tcPr>
+            <w:tcW w:type="pct" w:w="46%"/>
             <w:tcBorders>
               <w:top w:val="single" w:color="000000" w:sz="4"/>
               <w:left w:val="single" w:color="000000" w:sz="4"/>
@@ -3136,7 +3001,7 @@
                 <w:sz w:val="24"/>
                 <w:szCs w:val="24"/>
               </w:rPr>
-              <w:t xml:space="preserve">Rijen</w:t>
+              <w:t xml:space="preserve">Afhandeling van korrelverschil</w:t>
             </w:r>
           </w:p>
         </w:tc>
@@ -3144,88 +3009,88 @@
       <w:tr>
         <w:tc>
           <w:tcPr>
-            <w:tcW w:type="pct" w:w="40%"/>
-            <w:tcBorders>
-              <w:top w:val="single" w:color="000000" w:sz="4"/>
-              <w:left w:val="single" w:color="000000" w:sz="4"/>
-              <w:bottom w:val="single" w:color="000000" w:sz="4"/>
-              <w:right w:val="single" w:color="000000" w:sz="4"/>
-            </w:tcBorders>
-            <w:tcMar>
-              <w:top w:type="dxa" w:w="40"/>
-              <w:left w:type="dxa" w:w="80"/>
-              <w:bottom w:type="dxa" w:w="40"/>
-              <w:right w:type="dxa" w:w="80"/>
-            </w:tcMar>
-          </w:tcPr>
-          <w:p>
-            <w:r>
-              <w:rPr>
-                <w:rFonts w:ascii="Arial" w:cs="Arial" w:eastAsia="Arial" w:hAnsi="Arial"/>
-                <w:b w:val="false"/>
-                <w:bCs w:val="false"/>
-                <w:sz w:val="24"/>
-                <w:szCs w:val="24"/>
-              </w:rPr>
-              <w:t xml:space="preserve">dim_return_reason</w:t>
-            </w:r>
-          </w:p>
-        </w:tc>
-        <w:tc>
-          <w:tcPr>
-            <w:tcW w:type="pct" w:w="40%"/>
-            <w:tcBorders>
-              <w:top w:val="single" w:color="000000" w:sz="4"/>
-              <w:left w:val="single" w:color="000000" w:sz="4"/>
-              <w:bottom w:val="single" w:color="000000" w:sz="4"/>
-              <w:right w:val="single" w:color="000000" w:sz="4"/>
-            </w:tcBorders>
-            <w:tcMar>
-              <w:top w:type="dxa" w:w="40"/>
-              <w:left w:type="dxa" w:w="80"/>
-              <w:bottom w:type="dxa" w:w="40"/>
-              <w:right w:type="dxa" w:w="80"/>
-            </w:tcMar>
-          </w:tcPr>
-          <w:p>
-            <w:r>
-              <w:rPr>
-                <w:rFonts w:ascii="Arial" w:cs="Arial" w:eastAsia="Arial" w:hAnsi="Arial"/>
-                <w:b w:val="false"/>
-                <w:bCs w:val="false"/>
-                <w:sz w:val="24"/>
-                <w:szCs w:val="24"/>
-              </w:rPr>
-              <w:t xml:space="preserve">Dimensie (SCD2)</w:t>
-            </w:r>
-          </w:p>
-        </w:tc>
-        <w:tc>
-          <w:tcPr>
-            <w:tcW w:type="pct" w:w="20%"/>
-            <w:tcBorders>
-              <w:top w:val="single" w:color="000000" w:sz="4"/>
-              <w:left w:val="single" w:color="000000" w:sz="4"/>
-              <w:bottom w:val="single" w:color="000000" w:sz="4"/>
-              <w:right w:val="single" w:color="000000" w:sz="4"/>
-            </w:tcBorders>
-            <w:tcMar>
-              <w:top w:type="dxa" w:w="40"/>
-              <w:left w:type="dxa" w:w="80"/>
-              <w:bottom w:type="dxa" w:w="40"/>
-              <w:right w:type="dxa" w:w="80"/>
-            </w:tcMar>
-          </w:tcPr>
-          <w:p>
-            <w:r>
-              <w:rPr>
-                <w:rFonts w:ascii="Arial" w:cs="Arial" w:eastAsia="Arial" w:hAnsi="Arial"/>
-                <w:b w:val="false"/>
-                <w:bCs w:val="false"/>
-                <w:sz w:val="24"/>
-                <w:szCs w:val="24"/>
-              </w:rPr>
-              <w:t xml:space="preserve">5</w:t>
+            <w:tcW w:type="pct" w:w="24%"/>
+            <w:tcBorders>
+              <w:top w:val="single" w:color="000000" w:sz="4"/>
+              <w:left w:val="single" w:color="000000" w:sz="4"/>
+              <w:bottom w:val="single" w:color="000000" w:sz="4"/>
+              <w:right w:val="single" w:color="000000" w:sz="4"/>
+            </w:tcBorders>
+            <w:tcMar>
+              <w:top w:type="dxa" w:w="40"/>
+              <w:left w:type="dxa" w:w="80"/>
+              <w:bottom w:type="dxa" w:w="40"/>
+              <w:right w:type="dxa" w:w="80"/>
+            </w:tcMar>
+          </w:tcPr>
+          <w:p>
+            <w:r>
+              <w:rPr>
+                <w:rFonts w:ascii="Arial" w:cs="Arial" w:eastAsia="Arial" w:hAnsi="Arial"/>
+                <w:b w:val="false"/>
+                <w:bCs w:val="false"/>
+                <w:sz w:val="24"/>
+                <w:szCs w:val="24"/>
+              </w:rPr>
+              <w:t xml:space="preserve">fact_returns</w:t>
+            </w:r>
+          </w:p>
+        </w:tc>
+        <w:tc>
+          <w:tcPr>
+            <w:tcW w:type="pct" w:w="30%"/>
+            <w:tcBorders>
+              <w:top w:val="single" w:color="000000" w:sz="4"/>
+              <w:left w:val="single" w:color="000000" w:sz="4"/>
+              <w:bottom w:val="single" w:color="000000" w:sz="4"/>
+              <w:right w:val="single" w:color="000000" w:sz="4"/>
+            </w:tcBorders>
+            <w:tcMar>
+              <w:top w:type="dxa" w:w="40"/>
+              <w:left w:type="dxa" w:w="80"/>
+              <w:bottom w:type="dxa" w:w="40"/>
+              <w:right w:type="dxa" w:w="80"/>
+            </w:tcMar>
+          </w:tcPr>
+          <w:p>
+            <w:r>
+              <w:rPr>
+                <w:rFonts w:ascii="Arial" w:cs="Arial" w:eastAsia="Arial" w:hAnsi="Arial"/>
+                <w:b w:val="false"/>
+                <w:bCs w:val="false"/>
+                <w:sz w:val="24"/>
+                <w:szCs w:val="24"/>
+              </w:rPr>
+              <w:t xml:space="preserve">1 rij per retour (RETURN_CODE)</w:t>
+            </w:r>
+          </w:p>
+        </w:tc>
+        <w:tc>
+          <w:tcPr>
+            <w:tcW w:type="pct" w:w="46%"/>
+            <w:tcBorders>
+              <w:top w:val="single" w:color="000000" w:sz="4"/>
+              <w:left w:val="single" w:color="000000" w:sz="4"/>
+              <w:bottom w:val="single" w:color="000000" w:sz="4"/>
+              <w:right w:val="single" w:color="000000" w:sz="4"/>
+            </w:tcBorders>
+            <w:tcMar>
+              <w:top w:type="dxa" w:w="40"/>
+              <w:left w:type="dxa" w:w="80"/>
+              <w:bottom w:type="dxa" w:w="40"/>
+              <w:right w:type="dxa" w:w="80"/>
+            </w:tcMar>
+          </w:tcPr>
+          <w:p>
+            <w:r>
+              <w:rPr>
+                <w:rFonts w:ascii="Arial" w:cs="Arial" w:eastAsia="Arial" w:hAnsi="Arial"/>
+                <w:b w:val="false"/>
+                <w:bCs w:val="false"/>
+                <w:sz w:val="24"/>
+                <w:szCs w:val="24"/>
+              </w:rPr>
+              <w:t xml:space="preserve">Fijnste korrel; NIET geaggregeerd naar orderregel, hoewel 1 orderregel meerdere retouren kan hebben.</w:t>
             </w:r>
           </w:p>
         </w:tc>
@@ -3233,88 +3098,88 @@
       <w:tr>
         <w:tc>
           <w:tcPr>
-            <w:tcW w:type="pct" w:w="40%"/>
-            <w:tcBorders>
-              <w:top w:val="single" w:color="000000" w:sz="4"/>
-              <w:left w:val="single" w:color="000000" w:sz="4"/>
-              <w:bottom w:val="single" w:color="000000" w:sz="4"/>
-              <w:right w:val="single" w:color="000000" w:sz="4"/>
-            </w:tcBorders>
-            <w:tcMar>
-              <w:top w:type="dxa" w:w="40"/>
-              <w:left w:type="dxa" w:w="80"/>
-              <w:bottom w:type="dxa" w:w="40"/>
-              <w:right w:type="dxa" w:w="80"/>
-            </w:tcMar>
-          </w:tcPr>
-          <w:p>
-            <w:r>
-              <w:rPr>
-                <w:rFonts w:ascii="Arial" w:cs="Arial" w:eastAsia="Arial" w:hAnsi="Arial"/>
-                <w:b w:val="false"/>
-                <w:bCs w:val="false"/>
-                <w:sz w:val="24"/>
-                <w:szCs w:val="24"/>
-              </w:rPr>
-              <w:t xml:space="preserve">dim_course</w:t>
-            </w:r>
-          </w:p>
-        </w:tc>
-        <w:tc>
-          <w:tcPr>
-            <w:tcW w:type="pct" w:w="40%"/>
-            <w:tcBorders>
-              <w:top w:val="single" w:color="000000" w:sz="4"/>
-              <w:left w:val="single" w:color="000000" w:sz="4"/>
-              <w:bottom w:val="single" w:color="000000" w:sz="4"/>
-              <w:right w:val="single" w:color="000000" w:sz="4"/>
-            </w:tcBorders>
-            <w:tcMar>
-              <w:top w:type="dxa" w:w="40"/>
-              <w:left w:type="dxa" w:w="80"/>
-              <w:bottom w:type="dxa" w:w="40"/>
-              <w:right w:type="dxa" w:w="80"/>
-            </w:tcMar>
-          </w:tcPr>
-          <w:p>
-            <w:r>
-              <w:rPr>
-                <w:rFonts w:ascii="Arial" w:cs="Arial" w:eastAsia="Arial" w:hAnsi="Arial"/>
-                <w:b w:val="false"/>
-                <w:bCs w:val="false"/>
-                <w:sz w:val="24"/>
-                <w:szCs w:val="24"/>
-              </w:rPr>
-              <w:t xml:space="preserve">Dimensie (SCD2)</w:t>
-            </w:r>
-          </w:p>
-        </w:tc>
-        <w:tc>
-          <w:tcPr>
-            <w:tcW w:type="pct" w:w="20%"/>
-            <w:tcBorders>
-              <w:top w:val="single" w:color="000000" w:sz="4"/>
-              <w:left w:val="single" w:color="000000" w:sz="4"/>
-              <w:bottom w:val="single" w:color="000000" w:sz="4"/>
-              <w:right w:val="single" w:color="000000" w:sz="4"/>
-            </w:tcBorders>
-            <w:tcMar>
-              <w:top w:type="dxa" w:w="40"/>
-              <w:left w:type="dxa" w:w="80"/>
-              <w:bottom w:type="dxa" w:w="40"/>
-              <w:right w:type="dxa" w:w="80"/>
-            </w:tcMar>
-          </w:tcPr>
-          <w:p>
-            <w:r>
-              <w:rPr>
-                <w:rFonts w:ascii="Arial" w:cs="Arial" w:eastAsia="Arial" w:hAnsi="Arial"/>
-                <w:b w:val="false"/>
-                <w:bCs w:val="false"/>
-                <w:sz w:val="24"/>
-                <w:szCs w:val="24"/>
-              </w:rPr>
-              <w:t xml:space="preserve">9</w:t>
+            <w:tcW w:type="pct" w:w="24%"/>
+            <w:tcBorders>
+              <w:top w:val="single" w:color="000000" w:sz="4"/>
+              <w:left w:val="single" w:color="000000" w:sz="4"/>
+              <w:bottom w:val="single" w:color="000000" w:sz="4"/>
+              <w:right w:val="single" w:color="000000" w:sz="4"/>
+            </w:tcBorders>
+            <w:tcMar>
+              <w:top w:type="dxa" w:w="40"/>
+              <w:left w:type="dxa" w:w="80"/>
+              <w:bottom w:type="dxa" w:w="40"/>
+              <w:right w:type="dxa" w:w="80"/>
+            </w:tcMar>
+          </w:tcPr>
+          <w:p>
+            <w:r>
+              <w:rPr>
+                <w:rFonts w:ascii="Arial" w:cs="Arial" w:eastAsia="Arial" w:hAnsi="Arial"/>
+                <w:b w:val="false"/>
+                <w:bCs w:val="false"/>
+                <w:sz w:val="24"/>
+                <w:szCs w:val="24"/>
+              </w:rPr>
+              <w:t xml:space="preserve">fact_training</w:t>
+            </w:r>
+          </w:p>
+        </w:tc>
+        <w:tc>
+          <w:tcPr>
+            <w:tcW w:type="pct" w:w="30%"/>
+            <w:tcBorders>
+              <w:top w:val="single" w:color="000000" w:sz="4"/>
+              <w:left w:val="single" w:color="000000" w:sz="4"/>
+              <w:bottom w:val="single" w:color="000000" w:sz="4"/>
+              <w:right w:val="single" w:color="000000" w:sz="4"/>
+            </w:tcBorders>
+            <w:tcMar>
+              <w:top w:type="dxa" w:w="40"/>
+              <w:left w:type="dxa" w:w="80"/>
+              <w:bottom w:type="dxa" w:w="40"/>
+              <w:right w:type="dxa" w:w="80"/>
+            </w:tcMar>
+          </w:tcPr>
+          <w:p>
+            <w:r>
+              <w:rPr>
+                <w:rFonts w:ascii="Arial" w:cs="Arial" w:eastAsia="Arial" w:hAnsi="Arial"/>
+                <w:b w:val="false"/>
+                <w:bCs w:val="false"/>
+                <w:sz w:val="24"/>
+                <w:szCs w:val="24"/>
+              </w:rPr>
+              <w:t xml:space="preserve">medewerker × cursus × jaar</w:t>
+            </w:r>
+          </w:p>
+        </w:tc>
+        <w:tc>
+          <w:tcPr>
+            <w:tcW w:type="pct" w:w="46%"/>
+            <w:tcBorders>
+              <w:top w:val="single" w:color="000000" w:sz="4"/>
+              <w:left w:val="single" w:color="000000" w:sz="4"/>
+              <w:bottom w:val="single" w:color="000000" w:sz="4"/>
+              <w:right w:val="single" w:color="000000" w:sz="4"/>
+            </w:tcBorders>
+            <w:tcMar>
+              <w:top w:type="dxa" w:w="40"/>
+              <w:left w:type="dxa" w:w="80"/>
+              <w:bottom w:type="dxa" w:w="40"/>
+              <w:right w:type="dxa" w:w="80"/>
+            </w:tcMar>
+          </w:tcPr>
+          <w:p>
+            <w:r>
+              <w:rPr>
+                <w:rFonts w:ascii="Arial" w:cs="Arial" w:eastAsia="Arial" w:hAnsi="Arial"/>
+                <w:b w:val="false"/>
+                <w:bCs w:val="false"/>
+                <w:sz w:val="24"/>
+                <w:szCs w:val="24"/>
+              </w:rPr>
+              <w:t xml:space="preserve">Jaarkorrel; dag-dimensie niet van toepassing → jaar als degenererende dimensie (year_num).</w:t>
             </w:r>
           </w:p>
         </w:tc>
@@ -3322,274 +3187,7 @@
       <w:tr>
         <w:tc>
           <w:tcPr>
-            <w:tcW w:type="pct" w:w="40%"/>
-            <w:tcBorders>
-              <w:top w:val="single" w:color="000000" w:sz="4"/>
-              <w:left w:val="single" w:color="000000" w:sz="4"/>
-              <w:bottom w:val="single" w:color="000000" w:sz="4"/>
-              <w:right w:val="single" w:color="000000" w:sz="4"/>
-            </w:tcBorders>
-            <w:tcMar>
-              <w:top w:type="dxa" w:w="40"/>
-              <w:left w:type="dxa" w:w="80"/>
-              <w:bottom w:type="dxa" w:w="40"/>
-              <w:right w:type="dxa" w:w="80"/>
-            </w:tcMar>
-          </w:tcPr>
-          <w:p>
-            <w:r>
-              <w:rPr>
-                <w:rFonts w:ascii="Arial" w:cs="Arial" w:eastAsia="Arial" w:hAnsi="Arial"/>
-                <w:b w:val="false"/>
-                <w:bCs w:val="false"/>
-                <w:sz w:val="24"/>
-                <w:szCs w:val="24"/>
-              </w:rPr>
-              <w:t xml:space="preserve">dim_satisfaction_type</w:t>
-            </w:r>
-          </w:p>
-        </w:tc>
-        <w:tc>
-          <w:tcPr>
-            <w:tcW w:type="pct" w:w="40%"/>
-            <w:tcBorders>
-              <w:top w:val="single" w:color="000000" w:sz="4"/>
-              <w:left w:val="single" w:color="000000" w:sz="4"/>
-              <w:bottom w:val="single" w:color="000000" w:sz="4"/>
-              <w:right w:val="single" w:color="000000" w:sz="4"/>
-            </w:tcBorders>
-            <w:tcMar>
-              <w:top w:type="dxa" w:w="40"/>
-              <w:left w:type="dxa" w:w="80"/>
-              <w:bottom w:type="dxa" w:w="40"/>
-              <w:right w:type="dxa" w:w="80"/>
-            </w:tcMar>
-          </w:tcPr>
-          <w:p>
-            <w:r>
-              <w:rPr>
-                <w:rFonts w:ascii="Arial" w:cs="Arial" w:eastAsia="Arial" w:hAnsi="Arial"/>
-                <w:b w:val="false"/>
-                <w:bCs w:val="false"/>
-                <w:sz w:val="24"/>
-                <w:szCs w:val="24"/>
-              </w:rPr>
-              <w:t xml:space="preserve">Dimensie (SCD1)</w:t>
-            </w:r>
-          </w:p>
-        </w:tc>
-        <w:tc>
-          <w:tcPr>
-            <w:tcW w:type="pct" w:w="20%"/>
-            <w:tcBorders>
-              <w:top w:val="single" w:color="000000" w:sz="4"/>
-              <w:left w:val="single" w:color="000000" w:sz="4"/>
-              <w:bottom w:val="single" w:color="000000" w:sz="4"/>
-              <w:right w:val="single" w:color="000000" w:sz="4"/>
-            </w:tcBorders>
-            <w:tcMar>
-              <w:top w:type="dxa" w:w="40"/>
-              <w:left w:type="dxa" w:w="80"/>
-              <w:bottom w:type="dxa" w:w="40"/>
-              <w:right w:type="dxa" w:w="80"/>
-            </w:tcMar>
-          </w:tcPr>
-          <w:p>
-            <w:r>
-              <w:rPr>
-                <w:rFonts w:ascii="Arial" w:cs="Arial" w:eastAsia="Arial" w:hAnsi="Arial"/>
-                <w:b w:val="false"/>
-                <w:bCs w:val="false"/>
-                <w:sz w:val="24"/>
-                <w:szCs w:val="24"/>
-              </w:rPr>
-              <w:t xml:space="preserve">5</w:t>
-            </w:r>
-          </w:p>
-        </w:tc>
-      </w:tr>
-      <w:tr>
-        <w:tc>
-          <w:tcPr>
-            <w:tcW w:type="pct" w:w="40%"/>
-            <w:tcBorders>
-              <w:top w:val="single" w:color="000000" w:sz="4"/>
-              <w:left w:val="single" w:color="000000" w:sz="4"/>
-              <w:bottom w:val="single" w:color="000000" w:sz="4"/>
-              <w:right w:val="single" w:color="000000" w:sz="4"/>
-            </w:tcBorders>
-            <w:tcMar>
-              <w:top w:type="dxa" w:w="40"/>
-              <w:left w:type="dxa" w:w="80"/>
-              <w:bottom w:type="dxa" w:w="40"/>
-              <w:right w:type="dxa" w:w="80"/>
-            </w:tcMar>
-          </w:tcPr>
-          <w:p>
-            <w:r>
-              <w:rPr>
-                <w:rFonts w:ascii="Arial" w:cs="Arial" w:eastAsia="Arial" w:hAnsi="Arial"/>
-                <w:b w:val="false"/>
-                <w:bCs w:val="false"/>
-                <w:sz w:val="24"/>
-                <w:szCs w:val="24"/>
-              </w:rPr>
-              <w:t xml:space="preserve">fact_returns</w:t>
-            </w:r>
-          </w:p>
-        </w:tc>
-        <w:tc>
-          <w:tcPr>
-            <w:tcW w:type="pct" w:w="40%"/>
-            <w:tcBorders>
-              <w:top w:val="single" w:color="000000" w:sz="4"/>
-              <w:left w:val="single" w:color="000000" w:sz="4"/>
-              <w:bottom w:val="single" w:color="000000" w:sz="4"/>
-              <w:right w:val="single" w:color="000000" w:sz="4"/>
-            </w:tcBorders>
-            <w:tcMar>
-              <w:top w:type="dxa" w:w="40"/>
-              <w:left w:type="dxa" w:w="80"/>
-              <w:bottom w:type="dxa" w:w="40"/>
-              <w:right w:type="dxa" w:w="80"/>
-            </w:tcMar>
-          </w:tcPr>
-          <w:p>
-            <w:r>
-              <w:rPr>
-                <w:rFonts w:ascii="Arial" w:cs="Arial" w:eastAsia="Arial" w:hAnsi="Arial"/>
-                <w:b w:val="false"/>
-                <w:bCs w:val="false"/>
-                <w:sz w:val="24"/>
-                <w:szCs w:val="24"/>
-              </w:rPr>
-              <w:t xml:space="preserve">Feit</w:t>
-            </w:r>
-          </w:p>
-        </w:tc>
-        <w:tc>
-          <w:tcPr>
-            <w:tcW w:type="pct" w:w="20%"/>
-            <w:tcBorders>
-              <w:top w:val="single" w:color="000000" w:sz="4"/>
-              <w:left w:val="single" w:color="000000" w:sz="4"/>
-              <w:bottom w:val="single" w:color="000000" w:sz="4"/>
-              <w:right w:val="single" w:color="000000" w:sz="4"/>
-            </w:tcBorders>
-            <w:tcMar>
-              <w:top w:type="dxa" w:w="40"/>
-              <w:left w:type="dxa" w:w="80"/>
-              <w:bottom w:type="dxa" w:w="40"/>
-              <w:right w:type="dxa" w:w="80"/>
-            </w:tcMar>
-          </w:tcPr>
-          <w:p>
-            <w:r>
-              <w:rPr>
-                <w:rFonts w:ascii="Arial" w:cs="Arial" w:eastAsia="Arial" w:hAnsi="Arial"/>
-                <w:b w:val="false"/>
-                <w:bCs w:val="false"/>
-                <w:sz w:val="24"/>
-                <w:szCs w:val="24"/>
-              </w:rPr>
-              <w:t xml:space="preserve">690</w:t>
-            </w:r>
-          </w:p>
-        </w:tc>
-      </w:tr>
-      <w:tr>
-        <w:tc>
-          <w:tcPr>
-            <w:tcW w:type="pct" w:w="40%"/>
-            <w:tcBorders>
-              <w:top w:val="single" w:color="000000" w:sz="4"/>
-              <w:left w:val="single" w:color="000000" w:sz="4"/>
-              <w:bottom w:val="single" w:color="000000" w:sz="4"/>
-              <w:right w:val="single" w:color="000000" w:sz="4"/>
-            </w:tcBorders>
-            <w:tcMar>
-              <w:top w:type="dxa" w:w="40"/>
-              <w:left w:type="dxa" w:w="80"/>
-              <w:bottom w:type="dxa" w:w="40"/>
-              <w:right w:type="dxa" w:w="80"/>
-            </w:tcMar>
-          </w:tcPr>
-          <w:p>
-            <w:r>
-              <w:rPr>
-                <w:rFonts w:ascii="Arial" w:cs="Arial" w:eastAsia="Arial" w:hAnsi="Arial"/>
-                <w:b w:val="false"/>
-                <w:bCs w:val="false"/>
-                <w:sz w:val="24"/>
-                <w:szCs w:val="24"/>
-              </w:rPr>
-              <w:t xml:space="preserve">fact_training</w:t>
-            </w:r>
-          </w:p>
-        </w:tc>
-        <w:tc>
-          <w:tcPr>
-            <w:tcW w:type="pct" w:w="40%"/>
-            <w:tcBorders>
-              <w:top w:val="single" w:color="000000" w:sz="4"/>
-              <w:left w:val="single" w:color="000000" w:sz="4"/>
-              <w:bottom w:val="single" w:color="000000" w:sz="4"/>
-              <w:right w:val="single" w:color="000000" w:sz="4"/>
-            </w:tcBorders>
-            <w:tcMar>
-              <w:top w:type="dxa" w:w="40"/>
-              <w:left w:type="dxa" w:w="80"/>
-              <w:bottom w:type="dxa" w:w="40"/>
-              <w:right w:type="dxa" w:w="80"/>
-            </w:tcMar>
-          </w:tcPr>
-          <w:p>
-            <w:r>
-              <w:rPr>
-                <w:rFonts w:ascii="Arial" w:cs="Arial" w:eastAsia="Arial" w:hAnsi="Arial"/>
-                <w:b w:val="false"/>
-                <w:bCs w:val="false"/>
-                <w:sz w:val="24"/>
-                <w:szCs w:val="24"/>
-              </w:rPr>
-              <w:t xml:space="preserve">Feit</w:t>
-            </w:r>
-          </w:p>
-        </w:tc>
-        <w:tc>
-          <w:tcPr>
-            <w:tcW w:type="pct" w:w="20%"/>
-            <w:tcBorders>
-              <w:top w:val="single" w:color="000000" w:sz="4"/>
-              <w:left w:val="single" w:color="000000" w:sz="4"/>
-              <w:bottom w:val="single" w:color="000000" w:sz="4"/>
-              <w:right w:val="single" w:color="000000" w:sz="4"/>
-            </w:tcBorders>
-            <w:tcMar>
-              <w:top w:type="dxa" w:w="40"/>
-              <w:left w:type="dxa" w:w="80"/>
-              <w:bottom w:type="dxa" w:w="40"/>
-              <w:right w:type="dxa" w:w="80"/>
-            </w:tcMar>
-          </w:tcPr>
-          <w:p>
-            <w:r>
-              <w:rPr>
-                <w:rFonts w:ascii="Arial" w:cs="Arial" w:eastAsia="Arial" w:hAnsi="Arial"/>
-                <w:b w:val="false"/>
-                <w:bCs w:val="false"/>
-                <w:sz w:val="24"/>
-                <w:szCs w:val="24"/>
-              </w:rPr>
-              <w:t xml:space="preserve">402</w:t>
-            </w:r>
-          </w:p>
-        </w:tc>
-      </w:tr>
-      <w:tr>
-        <w:tc>
-          <w:tcPr>
-            <w:tcW w:type="pct" w:w="40%"/>
+            <w:tcW w:type="pct" w:w="24%"/>
             <w:tcBorders>
               <w:top w:val="single" w:color="000000" w:sz="4"/>
               <w:left w:val="single" w:color="000000" w:sz="4"/>
@@ -3618,59 +3216,59 @@
         </w:tc>
         <w:tc>
           <w:tcPr>
-            <w:tcW w:type="pct" w:w="40%"/>
-            <w:tcBorders>
-              <w:top w:val="single" w:color="000000" w:sz="4"/>
-              <w:left w:val="single" w:color="000000" w:sz="4"/>
-              <w:bottom w:val="single" w:color="000000" w:sz="4"/>
-              <w:right w:val="single" w:color="000000" w:sz="4"/>
-            </w:tcBorders>
-            <w:tcMar>
-              <w:top w:type="dxa" w:w="40"/>
-              <w:left w:type="dxa" w:w="80"/>
-              <w:bottom w:type="dxa" w:w="40"/>
-              <w:right w:type="dxa" w:w="80"/>
-            </w:tcMar>
-          </w:tcPr>
-          <w:p>
-            <w:r>
-              <w:rPr>
-                <w:rFonts w:ascii="Arial" w:cs="Arial" w:eastAsia="Arial" w:hAnsi="Arial"/>
-                <w:b w:val="false"/>
-                <w:bCs w:val="false"/>
-                <w:sz w:val="24"/>
-                <w:szCs w:val="24"/>
-              </w:rPr>
-              <w:t xml:space="preserve">Feit</w:t>
-            </w:r>
-          </w:p>
-        </w:tc>
-        <w:tc>
-          <w:tcPr>
-            <w:tcW w:type="pct" w:w="20%"/>
-            <w:tcBorders>
-              <w:top w:val="single" w:color="000000" w:sz="4"/>
-              <w:left w:val="single" w:color="000000" w:sz="4"/>
-              <w:bottom w:val="single" w:color="000000" w:sz="4"/>
-              <w:right w:val="single" w:color="000000" w:sz="4"/>
-            </w:tcBorders>
-            <w:tcMar>
-              <w:top w:type="dxa" w:w="40"/>
-              <w:left w:type="dxa" w:w="80"/>
-              <w:bottom w:type="dxa" w:w="40"/>
-              <w:right w:type="dxa" w:w="80"/>
-            </w:tcMar>
-          </w:tcPr>
-          <w:p>
-            <w:r>
-              <w:rPr>
-                <w:rFonts w:ascii="Arial" w:cs="Arial" w:eastAsia="Arial" w:hAnsi="Arial"/>
-                <w:b w:val="false"/>
-                <w:bCs w:val="false"/>
-                <w:sz w:val="24"/>
-                <w:szCs w:val="24"/>
-              </w:rPr>
-              <w:t xml:space="preserve">301</w:t>
+            <w:tcW w:type="pct" w:w="30%"/>
+            <w:tcBorders>
+              <w:top w:val="single" w:color="000000" w:sz="4"/>
+              <w:left w:val="single" w:color="000000" w:sz="4"/>
+              <w:bottom w:val="single" w:color="000000" w:sz="4"/>
+              <w:right w:val="single" w:color="000000" w:sz="4"/>
+            </w:tcBorders>
+            <w:tcMar>
+              <w:top w:type="dxa" w:w="40"/>
+              <w:left w:type="dxa" w:w="80"/>
+              <w:bottom w:type="dxa" w:w="40"/>
+              <w:right w:type="dxa" w:w="80"/>
+            </w:tcMar>
+          </w:tcPr>
+          <w:p>
+            <w:r>
+              <w:rPr>
+                <w:rFonts w:ascii="Arial" w:cs="Arial" w:eastAsia="Arial" w:hAnsi="Arial"/>
+                <w:b w:val="false"/>
+                <w:bCs w:val="false"/>
+                <w:sz w:val="24"/>
+                <w:szCs w:val="24"/>
+              </w:rPr>
+              <w:t xml:space="preserve">medewerker × jaar</w:t>
+            </w:r>
+          </w:p>
+        </w:tc>
+        <w:tc>
+          <w:tcPr>
+            <w:tcW w:type="pct" w:w="46%"/>
+            <w:tcBorders>
+              <w:top w:val="single" w:color="000000" w:sz="4"/>
+              <w:left w:val="single" w:color="000000" w:sz="4"/>
+              <w:bottom w:val="single" w:color="000000" w:sz="4"/>
+              <w:right w:val="single" w:color="000000" w:sz="4"/>
+            </w:tcBorders>
+            <w:tcMar>
+              <w:top w:type="dxa" w:w="40"/>
+              <w:left w:type="dxa" w:w="80"/>
+              <w:bottom w:type="dxa" w:w="40"/>
+              <w:right w:type="dxa" w:w="80"/>
+            </w:tcMar>
+          </w:tcPr>
+          <w:p>
+            <w:r>
+              <w:rPr>
+                <w:rFonts w:ascii="Arial" w:cs="Arial" w:eastAsia="Arial" w:hAnsi="Arial"/>
+                <w:b w:val="false"/>
+                <w:bCs w:val="false"/>
+                <w:sz w:val="24"/>
+                <w:szCs w:val="24"/>
+              </w:rPr>
+              <w:t xml:space="preserve">Idem: jaar als degenererende dimensie i.p.v. dim_date (dagniveau).</w:t>
             </w:r>
           </w:p>
         </w:tc>
@@ -3691,17 +3289,48 @@
     </w:p>
     <w:p>
       <w:pPr>
-        <w:pStyle w:val="Heading1"/>
-      </w:pPr>
-      <w:r>
-        <w:rPr>
-          <w:rFonts w:ascii="Arial" w:cs="Arial" w:eastAsia="Arial" w:hAnsi="Arial"/>
-          <w:b/>
-          <w:bCs/>
-          <w:sz w:val="24"/>
-          <w:szCs w:val="24"/>
-        </w:rPr>
-        <w:t xml:space="preserve">7. KPI's en onderbouwing</w:t>
+        <w:spacing w:after="160"/>
+      </w:pPr>
+      <w:r>
+        <w:rPr>
+          <w:rFonts w:ascii="Arial" w:cs="Arial" w:eastAsia="Arial" w:hAnsi="Arial"/>
+          <w:b/>
+          <w:bCs/>
+          <w:sz w:val="24"/>
+          <w:szCs w:val="24"/>
+        </w:rPr>
+        <w:t xml:space="preserve">Belangrijkste korrelverschil – dag vs. jaar: </w:t>
+      </w:r>
+      <w:r>
+        <w:rPr>
+          <w:rFonts w:ascii="Arial" w:cs="Arial" w:eastAsia="Arial" w:hAnsi="Arial"/>
+          <w:sz w:val="24"/>
+          <w:szCs w:val="24"/>
+        </w:rPr>
+        <w:t xml:space="preserve">dim_date is op dagniveau (gebruikt door verkoop en retouren), maar training- en tevredenheidsgegevens bestaan alleen per jaar. Een kunstmatige koppeling aan één dag zou schijnprecisie geven. Daarom is het jaar als degenererende dimensie (de kolom year_num) in de jaarfeiten opgenomen.</w:t>
+      </w:r>
+    </w:p>
+    <w:p>
+      <w:pPr>
+        <w:spacing w:after="160"/>
+      </w:pPr>
+      <w:r>
+        <w:rPr>
+          <w:rFonts w:ascii="Arial" w:cs="Arial" w:eastAsia="Arial" w:hAnsi="Arial"/>
+          <w:b/>
+          <w:bCs/>
+          <w:sz w:val="24"/>
+          <w:szCs w:val="24"/>
+        </w:rPr>
+        <w:t xml:space="preserve">Correcte aggregatie retourpercentage: </w:t>
+      </w:r>
+      <w:r>
+        <w:rPr>
+          <w:rFonts w:ascii="Arial" w:cs="Arial" w:eastAsia="Arial" w:hAnsi="Arial"/>
+          <w:sz w:val="24"/>
+          <w:szCs w:val="24"/>
+        </w:rPr>
+        <w:t xml:space="preserve">het verkochte aantal komt uit fact_order_sales (orderregel-korrel) en het geretourneerde aantal uit fact_returns (retour-korrel). Beide worden apart gesommeerd om dubbeltelling te voorkomen; original_quantity (dat per retourregel herhaald kan voorkomen) wordt daarbij niet opgeteld.</w:t>
       </w:r>
     </w:p>
     <w:p>
@@ -3716,7 +3345,20 @@
           <w:sz w:val="24"/>
           <w:szCs w:val="24"/>
         </w:rPr>
-        <w:t xml:space="preserve">7.1 Knelpunt 2 – Retouren</w:t>
+        <w:t xml:space="preserve">4.6 SCD-keuzes</w:t>
+      </w:r>
+    </w:p>
+    <w:p>
+      <w:pPr>
+        <w:spacing w:after="160"/>
+      </w:pPr>
+      <w:r>
+        <w:rPr>
+          <w:rFonts w:ascii="Arial" w:cs="Arial" w:eastAsia="Arial" w:hAnsi="Arial"/>
+          <w:sz w:val="24"/>
+          <w:szCs w:val="24"/>
+        </w:rPr>
+        <w:t xml:space="preserve">Conform de criteria zijn minimaal twee dimensies als SCD-type 2 geïmplementeerd en de rest als SCD-type 1:</w:t>
       </w:r>
     </w:p>
     <w:p>
@@ -3736,15 +3378,15 @@
           <w:sz w:val="24"/>
           <w:szCs w:val="24"/>
         </w:rPr>
-        <w:t xml:space="preserve">Retourpercentage </w:t>
-      </w:r>
-      <w:r>
-        <w:rPr>
-          <w:rFonts w:ascii="Arial" w:cs="Arial" w:eastAsia="Arial" w:hAnsi="Arial"/>
-          <w:sz w:val="24"/>
-          <w:szCs w:val="24"/>
-        </w:rPr>
-        <w:t xml:space="preserve">(= geretourneerd aantal / verkocht aantal) per product, productlijn en regio. Toont waar het structureel misgaat.</w:t>
+        <w:t xml:space="preserve">SCD-type 2: </w:t>
+      </w:r>
+      <w:r>
+        <w:rPr>
+          <w:rFonts w:ascii="Arial" w:cs="Arial" w:eastAsia="Arial" w:hAnsi="Arial"/>
+          <w:sz w:val="24"/>
+          <w:szCs w:val="24"/>
+        </w:rPr>
+        <w:t xml:space="preserve">dim_return_reason en dim_course. Bij een wijziging (bv. een aangepaste omschrijving) wordt de oude rij afgesloten (is_current = 0, valid_to gevuld) en een nieuwe versie toegevoegd. Zo blijft de historie bewaard.</w:t>
       </w:r>
     </w:p>
     <w:p>
@@ -3764,15 +3406,118 @@
           <w:sz w:val="24"/>
           <w:szCs w:val="24"/>
         </w:rPr>
-        <w:t xml:space="preserve">Retourwaarde (€) en gederfde marge (€) </w:t>
-      </w:r>
-      <w:r>
-        <w:rPr>
-          <w:rFonts w:ascii="Arial" w:cs="Arial" w:eastAsia="Arial" w:hAnsi="Arial"/>
-          <w:sz w:val="24"/>
-          <w:szCs w:val="24"/>
-        </w:rPr>
-        <w:t xml:space="preserve">– vertaalt retouren naar financiële impact, zodat prioriteiten objectief gesteld kunnen worden.</w:t>
+        <w:t xml:space="preserve">SCD-type 1: </w:t>
+      </w:r>
+      <w:r>
+        <w:rPr>
+          <w:rFonts w:ascii="Arial" w:cs="Arial" w:eastAsia="Arial" w:hAnsi="Arial"/>
+          <w:sz w:val="24"/>
+          <w:szCs w:val="24"/>
+        </w:rPr>
+        <w:t xml:space="preserve">dim_satisfaction_type wordt simpelweg overschreven.</w:t>
+      </w:r>
+    </w:p>
+    <w:p>
+      <w:pPr>
+        <w:pStyle w:val="Heading1"/>
+      </w:pPr>
+      <w:r>
+        <w:rPr>
+          <w:rFonts w:ascii="Arial" w:cs="Arial" w:eastAsia="Arial" w:hAnsi="Arial"/>
+          <w:b/>
+          <w:bCs/>
+          <w:sz w:val="24"/>
+          <w:szCs w:val="24"/>
+        </w:rPr>
+        <w:t xml:space="preserve">5. ETL-processen</w:t>
+      </w:r>
+    </w:p>
+    <w:p>
+      <w:pPr>
+        <w:spacing w:after="160"/>
+      </w:pPr>
+      <w:r>
+        <w:rPr>
+          <w:rFonts w:ascii="Arial" w:cs="Arial" w:eastAsia="Arial" w:hAnsi="Arial"/>
+          <w:sz w:val="24"/>
+          <w:szCs w:val="24"/>
+        </w:rPr>
+        <w:t xml:space="preserve">De ETL is geïmplementeerd in de notebook GO_DWH_Retouren_Cursussen_Notebook.ipynb. De notebook volgt dezelfde opzet als de bestaande pijplijn (paden → logging → schema → laden → views → export) en draait met één druk op de knop via de functie run_extra_pipeline(). Onderstaand ETL-schema toont per sterschema-klasse de datastroom: bron(nen) → transformatie/laadstappen → doeltabel, inclusief granulariteit.</w:t>
+      </w:r>
+    </w:p>
+    <w:p>
+      <w:pPr>
+        <w:spacing w:after="60" w:before="80"/>
+        <w:jc w:val="center"/>
+      </w:pPr>
+      <w:r>
+        <w:drawing>
+          <wp:inline distT="0" distB="0" distL="0" distR="0">
+            <wp:extent cx="5943600" cy="4029075"/>
+            <wp:effectExtent t="0" r="0" b="0" l="0"/>
+            <wp:docPr id="1" name="" descr="" title=""/>
+            <wp:cNvGraphicFramePr>
+              <a:graphicFrameLocks xmlns:a="http://schemas.openxmlformats.org/drawingml/2006/main" noChangeAspect="1"/>
+            </wp:cNvGraphicFramePr>
+            <a:graphic xmlns:a="http://schemas.openxmlformats.org/drawingml/2006/main">
+              <a:graphicData uri="http://schemas.openxmlformats.org/drawingml/2006/picture">
+                <pic:pic xmlns:pic="http://schemas.openxmlformats.org/drawingml/2006/picture">
+                  <pic:nvPicPr>
+                    <pic:cNvPr id="0" name="" descr=""/>
+                    <pic:cNvPicPr>
+                      <a:picLocks noChangeAspect="1" noChangeArrowheads="1"/>
+                    </pic:cNvPicPr>
+                  </pic:nvPicPr>
+                  <pic:blipFill>
+                    <a:blip r:embed="rId9" cstate="none"/>
+                    <a:srcRect/>
+                    <a:stretch>
+                      <a:fillRect/>
+                    </a:stretch>
+                  </pic:blipFill>
+                  <pic:spPr bwMode="auto">
+                    <a:xfrm>
+                      <a:off x="0" y="0"/>
+                      <a:ext cx="5943600" cy="4029075"/>
+                    </a:xfrm>
+                    <a:prstGeom prst="rect">
+                      <a:avLst/>
+                    </a:prstGeom>
+                  </pic:spPr>
+                </pic:pic>
+              </a:graphicData>
+            </a:graphic>
+          </wp:inline>
+        </w:drawing>
+      </w:r>
+    </w:p>
+    <w:p>
+      <w:pPr>
+        <w:spacing w:after="200"/>
+        <w:jc w:val="center"/>
+      </w:pPr>
+      <w:r>
+        <w:rPr>
+          <w:rFonts w:ascii="Arial" w:cs="Arial" w:eastAsia="Arial" w:hAnsi="Arial"/>
+          <w:b/>
+          <w:bCs/>
+          <w:sz w:val="24"/>
+          <w:szCs w:val="24"/>
+        </w:rPr>
+        <w:t xml:space="preserve">Figuur 2 – ETL-schema: datastroom per sterschema-klasse</w:t>
+      </w:r>
+    </w:p>
+    <w:p>
+      <w:pPr>
+        <w:spacing w:after="160"/>
+      </w:pPr>
+      <w:r>
+        <w:rPr>
+          <w:rFonts w:ascii="Arial" w:cs="Arial" w:eastAsia="Arial" w:hAnsi="Arial"/>
+          <w:sz w:val="24"/>
+          <w:szCs w:val="24"/>
+        </w:rPr>
+        <w:t xml:space="preserve">De globale stappen per klasse:</w:t>
       </w:r>
     </w:p>
     <w:p>
@@ -3792,15 +3537,15 @@
           <w:sz w:val="24"/>
           <w:szCs w:val="24"/>
         </w:rPr>
-        <w:t xml:space="preserve">Aandeel per retourreden/-categorie </w:t>
-      </w:r>
-      <w:r>
-        <w:rPr>
-          <w:rFonts w:ascii="Arial" w:cs="Arial" w:eastAsia="Arial" w:hAnsi="Arial"/>
-          <w:sz w:val="24"/>
-          <w:szCs w:val="24"/>
-        </w:rPr>
-        <w:t xml:space="preserve">– maakt onderscheid tussen kwaliteits-, logistieke en klantgerelateerde oorzaken.</w:t>
+        <w:t xml:space="preserve">Extract: </w:t>
+      </w:r>
+      <w:r>
+        <w:rPr>
+          <w:rFonts w:ascii="Arial" w:cs="Arial" w:eastAsia="Arial" w:hAnsi="Arial"/>
+          <w:sz w:val="24"/>
+          <w:szCs w:val="24"/>
+        </w:rPr>
+        <w:t xml:space="preserve">brontabellen worden uit GO_SDM.db gelezen (en, voor de feiten, sleutels uit het bestaande DWH).</w:t>
       </w:r>
     </w:p>
     <w:p>
@@ -3820,30 +3565,15 @@
           <w:sz w:val="24"/>
           <w:szCs w:val="24"/>
         </w:rPr>
-        <w:t xml:space="preserve">Retourtrend over tijd </w:t>
-      </w:r>
-      <w:r>
-        <w:rPr>
-          <w:rFonts w:ascii="Arial" w:cs="Arial" w:eastAsia="Arial" w:hAnsi="Arial"/>
-          <w:sz w:val="24"/>
-          <w:szCs w:val="24"/>
-        </w:rPr>
-        <w:t xml:space="preserve">– signaleert pieken en seizoenseffecten.</w:t>
-      </w:r>
-    </w:p>
-    <w:p>
-      <w:pPr>
-        <w:pStyle w:val="Heading2"/>
-      </w:pPr>
-      <w:r>
-        <w:rPr>
-          <w:rFonts w:ascii="Arial" w:cs="Arial" w:eastAsia="Arial" w:hAnsi="Arial"/>
-          <w:b/>
-          <w:bCs/>
-          <w:sz w:val="24"/>
-          <w:szCs w:val="24"/>
-        </w:rPr>
-        <w:t xml:space="preserve">7.2 Knelpunt 4 – Cursussen</w:t>
+        <w:t xml:space="preserve">Transform: </w:t>
+      </w:r>
+      <w:r>
+        <w:rPr>
+          <w:rFonts w:ascii="Arial" w:cs="Arial" w:eastAsia="Arial" w:hAnsi="Arial"/>
+          <w:sz w:val="24"/>
+          <w:szCs w:val="24"/>
+        </w:rPr>
+        <w:t xml:space="preserve">datums worden omgezet naar date_key (YYYYMMDD), categorieën en kosten worden afgeleid en sleutels worden opgezocht.</w:t>
       </w:r>
     </w:p>
     <w:p>
@@ -3863,15 +3593,753 @@
           <w:sz w:val="24"/>
           <w:szCs w:val="24"/>
         </w:rPr>
-        <w:t xml:space="preserve">Aantal deelnames per cursus en per medewerker </w:t>
-      </w:r>
-      <w:r>
-        <w:rPr>
-          <w:rFonts w:ascii="Arial" w:cs="Arial" w:eastAsia="Arial" w:hAnsi="Arial"/>
-          <w:sz w:val="24"/>
-          <w:szCs w:val="24"/>
-        </w:rPr>
-        <w:t xml:space="preserve">– geeft inzicht in de spreiding van trainingen.</w:t>
+        <w:t xml:space="preserve">Load: </w:t>
+      </w:r>
+      <w:r>
+        <w:rPr>
+          <w:rFonts w:ascii="Arial" w:cs="Arial" w:eastAsia="Arial" w:hAnsi="Arial"/>
+          <w:sz w:val="24"/>
+          <w:szCs w:val="24"/>
+        </w:rPr>
+        <w:t xml:space="preserve">dimensies via SCD-1/SCD-2, feiten via full reload.</w:t>
+      </w:r>
+    </w:p>
+    <w:p>
+      <w:pPr>
+        <w:spacing w:after="160"/>
+      </w:pPr>
+      <w:r>
+        <w:rPr>
+          <w:rFonts w:ascii="Arial" w:cs="Arial" w:eastAsia="Arial" w:hAnsi="Arial"/>
+          <w:b/>
+          <w:bCs/>
+          <w:sz w:val="24"/>
+          <w:szCs w:val="24"/>
+        </w:rPr>
+        <w:t xml:space="preserve">Slimme vereenvoudiging: </w:t>
+      </w:r>
+      <w:r>
+        <w:rPr>
+          <w:rFonts w:ascii="Arial" w:cs="Arial" w:eastAsia="Arial" w:hAnsi="Arial"/>
+          <w:sz w:val="24"/>
+          <w:szCs w:val="24"/>
+        </w:rPr>
+        <w:t xml:space="preserve">de retourregels worden gekoppeld aan de reeds gebouwde feittabel fact_order_sales (op order_detail_code). Daarmee zijn de product-, klant-, regio- en medewerkersleutels én de verkoopprijs direct beschikbaar, zonder die opzoekstappen te herhalen.</w:t>
+      </w:r>
+    </w:p>
+    <w:p>
+      <w:pPr>
+        <w:spacing w:after="160"/>
+      </w:pPr>
+      <w:r>
+        <w:rPr>
+          <w:rFonts w:ascii="Arial" w:cs="Arial" w:eastAsia="Arial" w:hAnsi="Arial"/>
+          <w:sz w:val="24"/>
+          <w:szCs w:val="24"/>
+        </w:rPr>
+        <w:t xml:space="preserve">Retourdatums die nog niet in dim_date stonden (81 datums) worden automatisch toegevoegd. Tijdens de run worden logregels weggeschreven naar logs/go_dwh_extra_etl.log (per stap: tabel, actie, aantal rijen, melding), zodat de pijplijnkwaliteit later in Power BI zichtbaar kan worden gemaakt. De inlaadstrategie voor de feiten is full reload, waardoor nieuwe, gewijzigde én verwijderde brongegevens correct meekomen bij een volgende run (de testprocedure met data ná 1 oktober 2025).</w:t>
+      </w:r>
+    </w:p>
+    <w:p>
+      <w:pPr>
+        <w:pStyle w:val="Heading1"/>
+      </w:pPr>
+      <w:r>
+        <w:rPr>
+          <w:rFonts w:ascii="Arial" w:cs="Arial" w:eastAsia="Arial" w:hAnsi="Arial"/>
+          <w:b/>
+          <w:bCs/>
+          <w:sz w:val="24"/>
+          <w:szCs w:val="24"/>
+        </w:rPr>
+        <w:t xml:space="preserve">6. Feiten- en dimensietabellen</w:t>
+      </w:r>
+    </w:p>
+    <w:tbl>
+      <w:tblPr>
+        <w:tblW w:type="pct" w:w="100%"/>
+        <w:tblBorders>
+          <w:top w:val="single" w:color="auto" w:sz="4"/>
+          <w:left w:val="single" w:color="auto" w:sz="4"/>
+          <w:bottom w:val="single" w:color="auto" w:sz="4"/>
+          <w:right w:val="single" w:color="auto" w:sz="4"/>
+          <w:insideH w:val="single" w:color="auto" w:sz="4"/>
+          <w:insideV w:val="single" w:color="auto" w:sz="4"/>
+        </w:tblBorders>
+      </w:tblPr>
+      <w:tblGrid>
+        <w:gridCol w:w="100"/>
+        <w:gridCol w:w="100"/>
+        <w:gridCol w:w="100"/>
+      </w:tblGrid>
+      <w:tr>
+        <w:trPr>
+          <w:tblHeader/>
+        </w:trPr>
+        <w:tc>
+          <w:tcPr>
+            <w:tcW w:type="pct" w:w="40%"/>
+            <w:tcBorders>
+              <w:top w:val="single" w:color="000000" w:sz="4"/>
+              <w:left w:val="single" w:color="000000" w:sz="4"/>
+              <w:bottom w:val="single" w:color="000000" w:sz="4"/>
+              <w:right w:val="single" w:color="000000" w:sz="4"/>
+            </w:tcBorders>
+            <w:tcMar>
+              <w:top w:type="dxa" w:w="40"/>
+              <w:left w:type="dxa" w:w="80"/>
+              <w:bottom w:type="dxa" w:w="40"/>
+              <w:right w:type="dxa" w:w="80"/>
+            </w:tcMar>
+          </w:tcPr>
+          <w:p>
+            <w:r>
+              <w:rPr>
+                <w:rFonts w:ascii="Arial" w:cs="Arial" w:eastAsia="Arial" w:hAnsi="Arial"/>
+                <w:b/>
+                <w:bCs/>
+                <w:sz w:val="24"/>
+                <w:szCs w:val="24"/>
+              </w:rPr>
+              <w:t xml:space="preserve">Tabel</w:t>
+            </w:r>
+          </w:p>
+        </w:tc>
+        <w:tc>
+          <w:tcPr>
+            <w:tcW w:type="pct" w:w="40%"/>
+            <w:tcBorders>
+              <w:top w:val="single" w:color="000000" w:sz="4"/>
+              <w:left w:val="single" w:color="000000" w:sz="4"/>
+              <w:bottom w:val="single" w:color="000000" w:sz="4"/>
+              <w:right w:val="single" w:color="000000" w:sz="4"/>
+            </w:tcBorders>
+            <w:tcMar>
+              <w:top w:type="dxa" w:w="40"/>
+              <w:left w:type="dxa" w:w="80"/>
+              <w:bottom w:type="dxa" w:w="40"/>
+              <w:right w:type="dxa" w:w="80"/>
+            </w:tcMar>
+          </w:tcPr>
+          <w:p>
+            <w:r>
+              <w:rPr>
+                <w:rFonts w:ascii="Arial" w:cs="Arial" w:eastAsia="Arial" w:hAnsi="Arial"/>
+                <w:b/>
+                <w:bCs/>
+                <w:sz w:val="24"/>
+                <w:szCs w:val="24"/>
+              </w:rPr>
+              <w:t xml:space="preserve">Soort</w:t>
+            </w:r>
+          </w:p>
+        </w:tc>
+        <w:tc>
+          <w:tcPr>
+            <w:tcW w:type="pct" w:w="20%"/>
+            <w:tcBorders>
+              <w:top w:val="single" w:color="000000" w:sz="4"/>
+              <w:left w:val="single" w:color="000000" w:sz="4"/>
+              <w:bottom w:val="single" w:color="000000" w:sz="4"/>
+              <w:right w:val="single" w:color="000000" w:sz="4"/>
+            </w:tcBorders>
+            <w:tcMar>
+              <w:top w:type="dxa" w:w="40"/>
+              <w:left w:type="dxa" w:w="80"/>
+              <w:bottom w:type="dxa" w:w="40"/>
+              <w:right w:type="dxa" w:w="80"/>
+            </w:tcMar>
+          </w:tcPr>
+          <w:p>
+            <w:r>
+              <w:rPr>
+                <w:rFonts w:ascii="Arial" w:cs="Arial" w:eastAsia="Arial" w:hAnsi="Arial"/>
+                <w:b/>
+                <w:bCs/>
+                <w:sz w:val="24"/>
+                <w:szCs w:val="24"/>
+              </w:rPr>
+              <w:t xml:space="preserve">Rijen</w:t>
+            </w:r>
+          </w:p>
+        </w:tc>
+      </w:tr>
+      <w:tr>
+        <w:tc>
+          <w:tcPr>
+            <w:tcW w:type="pct" w:w="40%"/>
+            <w:tcBorders>
+              <w:top w:val="single" w:color="000000" w:sz="4"/>
+              <w:left w:val="single" w:color="000000" w:sz="4"/>
+              <w:bottom w:val="single" w:color="000000" w:sz="4"/>
+              <w:right w:val="single" w:color="000000" w:sz="4"/>
+            </w:tcBorders>
+            <w:tcMar>
+              <w:top w:type="dxa" w:w="40"/>
+              <w:left w:type="dxa" w:w="80"/>
+              <w:bottom w:type="dxa" w:w="40"/>
+              <w:right w:type="dxa" w:w="80"/>
+            </w:tcMar>
+          </w:tcPr>
+          <w:p>
+            <w:r>
+              <w:rPr>
+                <w:rFonts w:ascii="Arial" w:cs="Arial" w:eastAsia="Arial" w:hAnsi="Arial"/>
+                <w:b w:val="false"/>
+                <w:bCs w:val="false"/>
+                <w:sz w:val="24"/>
+                <w:szCs w:val="24"/>
+              </w:rPr>
+              <w:t xml:space="preserve">dim_return_reason</w:t>
+            </w:r>
+          </w:p>
+        </w:tc>
+        <w:tc>
+          <w:tcPr>
+            <w:tcW w:type="pct" w:w="40%"/>
+            <w:tcBorders>
+              <w:top w:val="single" w:color="000000" w:sz="4"/>
+              <w:left w:val="single" w:color="000000" w:sz="4"/>
+              <w:bottom w:val="single" w:color="000000" w:sz="4"/>
+              <w:right w:val="single" w:color="000000" w:sz="4"/>
+            </w:tcBorders>
+            <w:tcMar>
+              <w:top w:type="dxa" w:w="40"/>
+              <w:left w:type="dxa" w:w="80"/>
+              <w:bottom w:type="dxa" w:w="40"/>
+              <w:right w:type="dxa" w:w="80"/>
+            </w:tcMar>
+          </w:tcPr>
+          <w:p>
+            <w:r>
+              <w:rPr>
+                <w:rFonts w:ascii="Arial" w:cs="Arial" w:eastAsia="Arial" w:hAnsi="Arial"/>
+                <w:b w:val="false"/>
+                <w:bCs w:val="false"/>
+                <w:sz w:val="24"/>
+                <w:szCs w:val="24"/>
+              </w:rPr>
+              <w:t xml:space="preserve">Dimensie (SCD2)</w:t>
+            </w:r>
+          </w:p>
+        </w:tc>
+        <w:tc>
+          <w:tcPr>
+            <w:tcW w:type="pct" w:w="20%"/>
+            <w:tcBorders>
+              <w:top w:val="single" w:color="000000" w:sz="4"/>
+              <w:left w:val="single" w:color="000000" w:sz="4"/>
+              <w:bottom w:val="single" w:color="000000" w:sz="4"/>
+              <w:right w:val="single" w:color="000000" w:sz="4"/>
+            </w:tcBorders>
+            <w:tcMar>
+              <w:top w:type="dxa" w:w="40"/>
+              <w:left w:type="dxa" w:w="80"/>
+              <w:bottom w:type="dxa" w:w="40"/>
+              <w:right w:type="dxa" w:w="80"/>
+            </w:tcMar>
+          </w:tcPr>
+          <w:p>
+            <w:r>
+              <w:rPr>
+                <w:rFonts w:ascii="Arial" w:cs="Arial" w:eastAsia="Arial" w:hAnsi="Arial"/>
+                <w:b w:val="false"/>
+                <w:bCs w:val="false"/>
+                <w:sz w:val="24"/>
+                <w:szCs w:val="24"/>
+              </w:rPr>
+              <w:t xml:space="preserve">5</w:t>
+            </w:r>
+          </w:p>
+        </w:tc>
+      </w:tr>
+      <w:tr>
+        <w:tc>
+          <w:tcPr>
+            <w:tcW w:type="pct" w:w="40%"/>
+            <w:tcBorders>
+              <w:top w:val="single" w:color="000000" w:sz="4"/>
+              <w:left w:val="single" w:color="000000" w:sz="4"/>
+              <w:bottom w:val="single" w:color="000000" w:sz="4"/>
+              <w:right w:val="single" w:color="000000" w:sz="4"/>
+            </w:tcBorders>
+            <w:tcMar>
+              <w:top w:type="dxa" w:w="40"/>
+              <w:left w:type="dxa" w:w="80"/>
+              <w:bottom w:type="dxa" w:w="40"/>
+              <w:right w:type="dxa" w:w="80"/>
+            </w:tcMar>
+          </w:tcPr>
+          <w:p>
+            <w:r>
+              <w:rPr>
+                <w:rFonts w:ascii="Arial" w:cs="Arial" w:eastAsia="Arial" w:hAnsi="Arial"/>
+                <w:b w:val="false"/>
+                <w:bCs w:val="false"/>
+                <w:sz w:val="24"/>
+                <w:szCs w:val="24"/>
+              </w:rPr>
+              <w:t xml:space="preserve">dim_course</w:t>
+            </w:r>
+          </w:p>
+        </w:tc>
+        <w:tc>
+          <w:tcPr>
+            <w:tcW w:type="pct" w:w="40%"/>
+            <w:tcBorders>
+              <w:top w:val="single" w:color="000000" w:sz="4"/>
+              <w:left w:val="single" w:color="000000" w:sz="4"/>
+              <w:bottom w:val="single" w:color="000000" w:sz="4"/>
+              <w:right w:val="single" w:color="000000" w:sz="4"/>
+            </w:tcBorders>
+            <w:tcMar>
+              <w:top w:type="dxa" w:w="40"/>
+              <w:left w:type="dxa" w:w="80"/>
+              <w:bottom w:type="dxa" w:w="40"/>
+              <w:right w:type="dxa" w:w="80"/>
+            </w:tcMar>
+          </w:tcPr>
+          <w:p>
+            <w:r>
+              <w:rPr>
+                <w:rFonts w:ascii="Arial" w:cs="Arial" w:eastAsia="Arial" w:hAnsi="Arial"/>
+                <w:b w:val="false"/>
+                <w:bCs w:val="false"/>
+                <w:sz w:val="24"/>
+                <w:szCs w:val="24"/>
+              </w:rPr>
+              <w:t xml:space="preserve">Dimensie (SCD2)</w:t>
+            </w:r>
+          </w:p>
+        </w:tc>
+        <w:tc>
+          <w:tcPr>
+            <w:tcW w:type="pct" w:w="20%"/>
+            <w:tcBorders>
+              <w:top w:val="single" w:color="000000" w:sz="4"/>
+              <w:left w:val="single" w:color="000000" w:sz="4"/>
+              <w:bottom w:val="single" w:color="000000" w:sz="4"/>
+              <w:right w:val="single" w:color="000000" w:sz="4"/>
+            </w:tcBorders>
+            <w:tcMar>
+              <w:top w:type="dxa" w:w="40"/>
+              <w:left w:type="dxa" w:w="80"/>
+              <w:bottom w:type="dxa" w:w="40"/>
+              <w:right w:type="dxa" w:w="80"/>
+            </w:tcMar>
+          </w:tcPr>
+          <w:p>
+            <w:r>
+              <w:rPr>
+                <w:rFonts w:ascii="Arial" w:cs="Arial" w:eastAsia="Arial" w:hAnsi="Arial"/>
+                <w:b w:val="false"/>
+                <w:bCs w:val="false"/>
+                <w:sz w:val="24"/>
+                <w:szCs w:val="24"/>
+              </w:rPr>
+              <w:t xml:space="preserve">9</w:t>
+            </w:r>
+          </w:p>
+        </w:tc>
+      </w:tr>
+      <w:tr>
+        <w:tc>
+          <w:tcPr>
+            <w:tcW w:type="pct" w:w="40%"/>
+            <w:tcBorders>
+              <w:top w:val="single" w:color="000000" w:sz="4"/>
+              <w:left w:val="single" w:color="000000" w:sz="4"/>
+              <w:bottom w:val="single" w:color="000000" w:sz="4"/>
+              <w:right w:val="single" w:color="000000" w:sz="4"/>
+            </w:tcBorders>
+            <w:tcMar>
+              <w:top w:type="dxa" w:w="40"/>
+              <w:left w:type="dxa" w:w="80"/>
+              <w:bottom w:type="dxa" w:w="40"/>
+              <w:right w:type="dxa" w:w="80"/>
+            </w:tcMar>
+          </w:tcPr>
+          <w:p>
+            <w:r>
+              <w:rPr>
+                <w:rFonts w:ascii="Arial" w:cs="Arial" w:eastAsia="Arial" w:hAnsi="Arial"/>
+                <w:b w:val="false"/>
+                <w:bCs w:val="false"/>
+                <w:sz w:val="24"/>
+                <w:szCs w:val="24"/>
+              </w:rPr>
+              <w:t xml:space="preserve">dim_satisfaction_type</w:t>
+            </w:r>
+          </w:p>
+        </w:tc>
+        <w:tc>
+          <w:tcPr>
+            <w:tcW w:type="pct" w:w="40%"/>
+            <w:tcBorders>
+              <w:top w:val="single" w:color="000000" w:sz="4"/>
+              <w:left w:val="single" w:color="000000" w:sz="4"/>
+              <w:bottom w:val="single" w:color="000000" w:sz="4"/>
+              <w:right w:val="single" w:color="000000" w:sz="4"/>
+            </w:tcBorders>
+            <w:tcMar>
+              <w:top w:type="dxa" w:w="40"/>
+              <w:left w:type="dxa" w:w="80"/>
+              <w:bottom w:type="dxa" w:w="40"/>
+              <w:right w:type="dxa" w:w="80"/>
+            </w:tcMar>
+          </w:tcPr>
+          <w:p>
+            <w:r>
+              <w:rPr>
+                <w:rFonts w:ascii="Arial" w:cs="Arial" w:eastAsia="Arial" w:hAnsi="Arial"/>
+                <w:b w:val="false"/>
+                <w:bCs w:val="false"/>
+                <w:sz w:val="24"/>
+                <w:szCs w:val="24"/>
+              </w:rPr>
+              <w:t xml:space="preserve">Dimensie (SCD1)</w:t>
+            </w:r>
+          </w:p>
+        </w:tc>
+        <w:tc>
+          <w:tcPr>
+            <w:tcW w:type="pct" w:w="20%"/>
+            <w:tcBorders>
+              <w:top w:val="single" w:color="000000" w:sz="4"/>
+              <w:left w:val="single" w:color="000000" w:sz="4"/>
+              <w:bottom w:val="single" w:color="000000" w:sz="4"/>
+              <w:right w:val="single" w:color="000000" w:sz="4"/>
+            </w:tcBorders>
+            <w:tcMar>
+              <w:top w:type="dxa" w:w="40"/>
+              <w:left w:type="dxa" w:w="80"/>
+              <w:bottom w:type="dxa" w:w="40"/>
+              <w:right w:type="dxa" w:w="80"/>
+            </w:tcMar>
+          </w:tcPr>
+          <w:p>
+            <w:r>
+              <w:rPr>
+                <w:rFonts w:ascii="Arial" w:cs="Arial" w:eastAsia="Arial" w:hAnsi="Arial"/>
+                <w:b w:val="false"/>
+                <w:bCs w:val="false"/>
+                <w:sz w:val="24"/>
+                <w:szCs w:val="24"/>
+              </w:rPr>
+              <w:t xml:space="preserve">5</w:t>
+            </w:r>
+          </w:p>
+        </w:tc>
+      </w:tr>
+      <w:tr>
+        <w:tc>
+          <w:tcPr>
+            <w:tcW w:type="pct" w:w="40%"/>
+            <w:tcBorders>
+              <w:top w:val="single" w:color="000000" w:sz="4"/>
+              <w:left w:val="single" w:color="000000" w:sz="4"/>
+              <w:bottom w:val="single" w:color="000000" w:sz="4"/>
+              <w:right w:val="single" w:color="000000" w:sz="4"/>
+            </w:tcBorders>
+            <w:tcMar>
+              <w:top w:type="dxa" w:w="40"/>
+              <w:left w:type="dxa" w:w="80"/>
+              <w:bottom w:type="dxa" w:w="40"/>
+              <w:right w:type="dxa" w:w="80"/>
+            </w:tcMar>
+          </w:tcPr>
+          <w:p>
+            <w:r>
+              <w:rPr>
+                <w:rFonts w:ascii="Arial" w:cs="Arial" w:eastAsia="Arial" w:hAnsi="Arial"/>
+                <w:b w:val="false"/>
+                <w:bCs w:val="false"/>
+                <w:sz w:val="24"/>
+                <w:szCs w:val="24"/>
+              </w:rPr>
+              <w:t xml:space="preserve">fact_returns</w:t>
+            </w:r>
+          </w:p>
+        </w:tc>
+        <w:tc>
+          <w:tcPr>
+            <w:tcW w:type="pct" w:w="40%"/>
+            <w:tcBorders>
+              <w:top w:val="single" w:color="000000" w:sz="4"/>
+              <w:left w:val="single" w:color="000000" w:sz="4"/>
+              <w:bottom w:val="single" w:color="000000" w:sz="4"/>
+              <w:right w:val="single" w:color="000000" w:sz="4"/>
+            </w:tcBorders>
+            <w:tcMar>
+              <w:top w:type="dxa" w:w="40"/>
+              <w:left w:type="dxa" w:w="80"/>
+              <w:bottom w:type="dxa" w:w="40"/>
+              <w:right w:type="dxa" w:w="80"/>
+            </w:tcMar>
+          </w:tcPr>
+          <w:p>
+            <w:r>
+              <w:rPr>
+                <w:rFonts w:ascii="Arial" w:cs="Arial" w:eastAsia="Arial" w:hAnsi="Arial"/>
+                <w:b w:val="false"/>
+                <w:bCs w:val="false"/>
+                <w:sz w:val="24"/>
+                <w:szCs w:val="24"/>
+              </w:rPr>
+              <w:t xml:space="preserve">Feit</w:t>
+            </w:r>
+          </w:p>
+        </w:tc>
+        <w:tc>
+          <w:tcPr>
+            <w:tcW w:type="pct" w:w="20%"/>
+            <w:tcBorders>
+              <w:top w:val="single" w:color="000000" w:sz="4"/>
+              <w:left w:val="single" w:color="000000" w:sz="4"/>
+              <w:bottom w:val="single" w:color="000000" w:sz="4"/>
+              <w:right w:val="single" w:color="000000" w:sz="4"/>
+            </w:tcBorders>
+            <w:tcMar>
+              <w:top w:type="dxa" w:w="40"/>
+              <w:left w:type="dxa" w:w="80"/>
+              <w:bottom w:type="dxa" w:w="40"/>
+              <w:right w:type="dxa" w:w="80"/>
+            </w:tcMar>
+          </w:tcPr>
+          <w:p>
+            <w:r>
+              <w:rPr>
+                <w:rFonts w:ascii="Arial" w:cs="Arial" w:eastAsia="Arial" w:hAnsi="Arial"/>
+                <w:b w:val="false"/>
+                <w:bCs w:val="false"/>
+                <w:sz w:val="24"/>
+                <w:szCs w:val="24"/>
+              </w:rPr>
+              <w:t xml:space="preserve">690</w:t>
+            </w:r>
+          </w:p>
+        </w:tc>
+      </w:tr>
+      <w:tr>
+        <w:tc>
+          <w:tcPr>
+            <w:tcW w:type="pct" w:w="40%"/>
+            <w:tcBorders>
+              <w:top w:val="single" w:color="000000" w:sz="4"/>
+              <w:left w:val="single" w:color="000000" w:sz="4"/>
+              <w:bottom w:val="single" w:color="000000" w:sz="4"/>
+              <w:right w:val="single" w:color="000000" w:sz="4"/>
+            </w:tcBorders>
+            <w:tcMar>
+              <w:top w:type="dxa" w:w="40"/>
+              <w:left w:type="dxa" w:w="80"/>
+              <w:bottom w:type="dxa" w:w="40"/>
+              <w:right w:type="dxa" w:w="80"/>
+            </w:tcMar>
+          </w:tcPr>
+          <w:p>
+            <w:r>
+              <w:rPr>
+                <w:rFonts w:ascii="Arial" w:cs="Arial" w:eastAsia="Arial" w:hAnsi="Arial"/>
+                <w:b w:val="false"/>
+                <w:bCs w:val="false"/>
+                <w:sz w:val="24"/>
+                <w:szCs w:val="24"/>
+              </w:rPr>
+              <w:t xml:space="preserve">fact_training</w:t>
+            </w:r>
+          </w:p>
+        </w:tc>
+        <w:tc>
+          <w:tcPr>
+            <w:tcW w:type="pct" w:w="40%"/>
+            <w:tcBorders>
+              <w:top w:val="single" w:color="000000" w:sz="4"/>
+              <w:left w:val="single" w:color="000000" w:sz="4"/>
+              <w:bottom w:val="single" w:color="000000" w:sz="4"/>
+              <w:right w:val="single" w:color="000000" w:sz="4"/>
+            </w:tcBorders>
+            <w:tcMar>
+              <w:top w:type="dxa" w:w="40"/>
+              <w:left w:type="dxa" w:w="80"/>
+              <w:bottom w:type="dxa" w:w="40"/>
+              <w:right w:type="dxa" w:w="80"/>
+            </w:tcMar>
+          </w:tcPr>
+          <w:p>
+            <w:r>
+              <w:rPr>
+                <w:rFonts w:ascii="Arial" w:cs="Arial" w:eastAsia="Arial" w:hAnsi="Arial"/>
+                <w:b w:val="false"/>
+                <w:bCs w:val="false"/>
+                <w:sz w:val="24"/>
+                <w:szCs w:val="24"/>
+              </w:rPr>
+              <w:t xml:space="preserve">Feit</w:t>
+            </w:r>
+          </w:p>
+        </w:tc>
+        <w:tc>
+          <w:tcPr>
+            <w:tcW w:type="pct" w:w="20%"/>
+            <w:tcBorders>
+              <w:top w:val="single" w:color="000000" w:sz="4"/>
+              <w:left w:val="single" w:color="000000" w:sz="4"/>
+              <w:bottom w:val="single" w:color="000000" w:sz="4"/>
+              <w:right w:val="single" w:color="000000" w:sz="4"/>
+            </w:tcBorders>
+            <w:tcMar>
+              <w:top w:type="dxa" w:w="40"/>
+              <w:left w:type="dxa" w:w="80"/>
+              <w:bottom w:type="dxa" w:w="40"/>
+              <w:right w:type="dxa" w:w="80"/>
+            </w:tcMar>
+          </w:tcPr>
+          <w:p>
+            <w:r>
+              <w:rPr>
+                <w:rFonts w:ascii="Arial" w:cs="Arial" w:eastAsia="Arial" w:hAnsi="Arial"/>
+                <w:b w:val="false"/>
+                <w:bCs w:val="false"/>
+                <w:sz w:val="24"/>
+                <w:szCs w:val="24"/>
+              </w:rPr>
+              <w:t xml:space="preserve">402</w:t>
+            </w:r>
+          </w:p>
+        </w:tc>
+      </w:tr>
+      <w:tr>
+        <w:tc>
+          <w:tcPr>
+            <w:tcW w:type="pct" w:w="40%"/>
+            <w:tcBorders>
+              <w:top w:val="single" w:color="000000" w:sz="4"/>
+              <w:left w:val="single" w:color="000000" w:sz="4"/>
+              <w:bottom w:val="single" w:color="000000" w:sz="4"/>
+              <w:right w:val="single" w:color="000000" w:sz="4"/>
+            </w:tcBorders>
+            <w:tcMar>
+              <w:top w:type="dxa" w:w="40"/>
+              <w:left w:type="dxa" w:w="80"/>
+              <w:bottom w:type="dxa" w:w="40"/>
+              <w:right w:type="dxa" w:w="80"/>
+            </w:tcMar>
+          </w:tcPr>
+          <w:p>
+            <w:r>
+              <w:rPr>
+                <w:rFonts w:ascii="Arial" w:cs="Arial" w:eastAsia="Arial" w:hAnsi="Arial"/>
+                <w:b w:val="false"/>
+                <w:bCs w:val="false"/>
+                <w:sz w:val="24"/>
+                <w:szCs w:val="24"/>
+              </w:rPr>
+              <w:t xml:space="preserve">fact_staff_satisfaction</w:t>
+            </w:r>
+          </w:p>
+        </w:tc>
+        <w:tc>
+          <w:tcPr>
+            <w:tcW w:type="pct" w:w="40%"/>
+            <w:tcBorders>
+              <w:top w:val="single" w:color="000000" w:sz="4"/>
+              <w:left w:val="single" w:color="000000" w:sz="4"/>
+              <w:bottom w:val="single" w:color="000000" w:sz="4"/>
+              <w:right w:val="single" w:color="000000" w:sz="4"/>
+            </w:tcBorders>
+            <w:tcMar>
+              <w:top w:type="dxa" w:w="40"/>
+              <w:left w:type="dxa" w:w="80"/>
+              <w:bottom w:type="dxa" w:w="40"/>
+              <w:right w:type="dxa" w:w="80"/>
+            </w:tcMar>
+          </w:tcPr>
+          <w:p>
+            <w:r>
+              <w:rPr>
+                <w:rFonts w:ascii="Arial" w:cs="Arial" w:eastAsia="Arial" w:hAnsi="Arial"/>
+                <w:b w:val="false"/>
+                <w:bCs w:val="false"/>
+                <w:sz w:val="24"/>
+                <w:szCs w:val="24"/>
+              </w:rPr>
+              <w:t xml:space="preserve">Feit</w:t>
+            </w:r>
+          </w:p>
+        </w:tc>
+        <w:tc>
+          <w:tcPr>
+            <w:tcW w:type="pct" w:w="20%"/>
+            <w:tcBorders>
+              <w:top w:val="single" w:color="000000" w:sz="4"/>
+              <w:left w:val="single" w:color="000000" w:sz="4"/>
+              <w:bottom w:val="single" w:color="000000" w:sz="4"/>
+              <w:right w:val="single" w:color="000000" w:sz="4"/>
+            </w:tcBorders>
+            <w:tcMar>
+              <w:top w:type="dxa" w:w="40"/>
+              <w:left w:type="dxa" w:w="80"/>
+              <w:bottom w:type="dxa" w:w="40"/>
+              <w:right w:type="dxa" w:w="80"/>
+            </w:tcMar>
+          </w:tcPr>
+          <w:p>
+            <w:r>
+              <w:rPr>
+                <w:rFonts w:ascii="Arial" w:cs="Arial" w:eastAsia="Arial" w:hAnsi="Arial"/>
+                <w:b w:val="false"/>
+                <w:bCs w:val="false"/>
+                <w:sz w:val="24"/>
+                <w:szCs w:val="24"/>
+              </w:rPr>
+              <w:t xml:space="preserve">301</w:t>
+            </w:r>
+          </w:p>
+        </w:tc>
+      </w:tr>
+    </w:tbl>
+    <w:p>
+      <w:pPr>
+        <w:spacing w:after="120"/>
+      </w:pPr>
+      <w:r>
+        <w:rPr>
+          <w:rFonts w:ascii="Arial" w:cs="Arial" w:eastAsia="Arial" w:hAnsi="Arial"/>
+          <w:sz w:val="24"/>
+          <w:szCs w:val="24"/>
+        </w:rPr>
+        <w:t xml:space="preserve"/>
+      </w:r>
+    </w:p>
+    <w:p>
+      <w:pPr>
+        <w:pStyle w:val="Heading1"/>
+      </w:pPr>
+      <w:r>
+        <w:rPr>
+          <w:rFonts w:ascii="Arial" w:cs="Arial" w:eastAsia="Arial" w:hAnsi="Arial"/>
+          <w:b/>
+          <w:bCs/>
+          <w:sz w:val="24"/>
+          <w:szCs w:val="24"/>
+        </w:rPr>
+        <w:t xml:space="preserve">7. KPI's en onderbouwing</w:t>
+      </w:r>
+    </w:p>
+    <w:p>
+      <w:pPr>
+        <w:pStyle w:val="Heading2"/>
+      </w:pPr>
+      <w:r>
+        <w:rPr>
+          <w:rFonts w:ascii="Arial" w:cs="Arial" w:eastAsia="Arial" w:hAnsi="Arial"/>
+          <w:b/>
+          <w:bCs/>
+          <w:sz w:val="24"/>
+          <w:szCs w:val="24"/>
+        </w:rPr>
+        <w:t xml:space="preserve">7.1 Knelpunt 2 – Retouren</w:t>
       </w:r>
     </w:p>
     <w:p>
@@ -3891,15 +4359,15 @@
           <w:sz w:val="24"/>
           <w:szCs w:val="24"/>
         </w:rPr>
-        <w:t xml:space="preserve">(Aangenomen) cursuskosten per categorie </w:t>
-      </w:r>
-      <w:r>
-        <w:rPr>
-          <w:rFonts w:ascii="Arial" w:cs="Arial" w:eastAsia="Arial" w:hAnsi="Arial"/>
-          <w:sz w:val="24"/>
-          <w:szCs w:val="24"/>
-        </w:rPr>
-        <w:t xml:space="preserve">– maakt de investering in opleiding zichtbaar.</w:t>
+        <w:t xml:space="preserve">Retourpercentage </w:t>
+      </w:r>
+      <w:r>
+        <w:rPr>
+          <w:rFonts w:ascii="Arial" w:cs="Arial" w:eastAsia="Arial" w:hAnsi="Arial"/>
+          <w:sz w:val="24"/>
+          <w:szCs w:val="24"/>
+        </w:rPr>
+        <w:t xml:space="preserve">(= geretourneerd aantal / verkocht aantal) per product, productlijn en regio. Toont waar het structureel misgaat.</w:t>
       </w:r>
     </w:p>
     <w:p>
@@ -3919,15 +4387,15 @@
           <w:sz w:val="24"/>
           <w:szCs w:val="24"/>
         </w:rPr>
-        <w:t xml:space="preserve">Gemiddelde tevredenheid per jaar </w:t>
-      </w:r>
-      <w:r>
-        <w:rPr>
-          <w:rFonts w:ascii="Arial" w:cs="Arial" w:eastAsia="Arial" w:hAnsi="Arial"/>
-          <w:sz w:val="24"/>
-          <w:szCs w:val="24"/>
-        </w:rPr>
-        <w:t xml:space="preserve">– volgt de ontwikkeling van medewerkertevredenheid.</w:t>
+        <w:t xml:space="preserve">Retourwaarde (€) en gederfde marge (€) </w:t>
+      </w:r>
+      <w:r>
+        <w:rPr>
+          <w:rFonts w:ascii="Arial" w:cs="Arial" w:eastAsia="Arial" w:hAnsi="Arial"/>
+          <w:sz w:val="24"/>
+          <w:szCs w:val="24"/>
+        </w:rPr>
+        <w:t xml:space="preserve">– vertaalt retouren naar financiële impact, zodat prioriteiten objectief gesteld kunnen worden.</w:t>
       </w:r>
     </w:p>
     <w:p>
@@ -3947,43 +4415,15 @@
           <w:sz w:val="24"/>
           <w:szCs w:val="24"/>
         </w:rPr>
-        <w:t xml:space="preserve">Tevredenheid naar aantal gevolgde cursussen </w:t>
-      </w:r>
-      <w:r>
-        <w:rPr>
-          <w:rFonts w:ascii="Arial" w:cs="Arial" w:eastAsia="Arial" w:hAnsi="Arial"/>
-          <w:sz w:val="24"/>
-          <w:szCs w:val="24"/>
-        </w:rPr>
-        <w:t xml:space="preserve">– toont of training samenhangt met hogere tevredenheid (effectmeting).</w:t>
-      </w:r>
-    </w:p>
-    <w:p>
-      <w:pPr>
-        <w:pStyle w:val="Heading1"/>
-      </w:pPr>
-      <w:r>
-        <w:rPr>
-          <w:rFonts w:ascii="Arial" w:cs="Arial" w:eastAsia="Arial" w:hAnsi="Arial"/>
-          <w:b/>
-          <w:bCs/>
-          <w:sz w:val="24"/>
-          <w:szCs w:val="24"/>
-        </w:rPr>
-        <w:t xml:space="preserve">8. Power BI-analyses en dashboards</w:t>
-      </w:r>
-    </w:p>
-    <w:p>
-      <w:pPr>
-        <w:spacing w:after="160"/>
-      </w:pPr>
-      <w:r>
-        <w:rPr>
-          <w:rFonts w:ascii="Arial" w:cs="Arial" w:eastAsia="Arial" w:hAnsi="Arial"/>
-          <w:sz w:val="24"/>
-          <w:szCs w:val="24"/>
-        </w:rPr>
-        <w:t xml:space="preserve">Omdat Power BI SQLite lastig leest, exporteert de notebook alle benodigde tabellen naar CSV (map powerbi_exports). Het volledige bouwplan met relaties en kant-en-klare DAX-measures staat in PowerBI_build_gids.md. Er zijn twee dashboardpagina's:</w:t>
+        <w:t xml:space="preserve">Aandeel per retourreden/-categorie </w:t>
+      </w:r>
+      <w:r>
+        <w:rPr>
+          <w:rFonts w:ascii="Arial" w:cs="Arial" w:eastAsia="Arial" w:hAnsi="Arial"/>
+          <w:sz w:val="24"/>
+          <w:szCs w:val="24"/>
+        </w:rPr>
+        <w:t xml:space="preserve">– maakt onderscheid tussen kwaliteits-, logistieke en klantgerelateerde oorzaken.</w:t>
       </w:r>
     </w:p>
     <w:p>
@@ -4003,15 +4443,30 @@
           <w:sz w:val="24"/>
           <w:szCs w:val="24"/>
         </w:rPr>
-        <w:t xml:space="preserve">Pagina 'Retouren': </w:t>
-      </w:r>
-      <w:r>
-        <w:rPr>
-          <w:rFonts w:ascii="Arial" w:cs="Arial" w:eastAsia="Arial" w:hAnsi="Arial"/>
-          <w:sz w:val="24"/>
-          <w:szCs w:val="24"/>
-        </w:rPr>
-        <w:t xml:space="preserve">KPI-kaarten (retourwaarde, gederfde marge, retourpercentage), staafdiagram per retourreden/-categorie, kaart per regio, tabel met top-producten en een trendlijn. Interactief met slicers (jaar, land, categorie, productlijn) en drill-down product en regio.</w:t>
+        <w:t xml:space="preserve">Retourtrend over tijd </w:t>
+      </w:r>
+      <w:r>
+        <w:rPr>
+          <w:rFonts w:ascii="Arial" w:cs="Arial" w:eastAsia="Arial" w:hAnsi="Arial"/>
+          <w:sz w:val="24"/>
+          <w:szCs w:val="24"/>
+        </w:rPr>
+        <w:t xml:space="preserve">– signaleert pieken en seizoenseffecten.</w:t>
+      </w:r>
+    </w:p>
+    <w:p>
+      <w:pPr>
+        <w:pStyle w:val="Heading2"/>
+      </w:pPr>
+      <w:r>
+        <w:rPr>
+          <w:rFonts w:ascii="Arial" w:cs="Arial" w:eastAsia="Arial" w:hAnsi="Arial"/>
+          <w:b/>
+          <w:bCs/>
+          <w:sz w:val="24"/>
+          <w:szCs w:val="24"/>
+        </w:rPr>
+        <w:t xml:space="preserve">7.2 Knelpunt 4 – Cursussen</w:t>
       </w:r>
     </w:p>
     <w:p>
@@ -4031,71 +4486,15 @@
           <w:sz w:val="24"/>
           <w:szCs w:val="24"/>
         </w:rPr>
-        <w:t xml:space="preserve">Pagina 'Cursussen &amp; tevredenheid': </w:t>
-      </w:r>
-      <w:r>
-        <w:rPr>
-          <w:rFonts w:ascii="Arial" w:cs="Arial" w:eastAsia="Arial" w:hAnsi="Arial"/>
-          <w:sz w:val="24"/>
-          <w:szCs w:val="24"/>
-        </w:rPr>
-        <w:t xml:space="preserve">KPI-kaarten (deelnames, kosten, gemiddelde tevredenheid), deelname per cursus, kosten per categorie, tevredenheid per jaar en tevredenheid per trainingsgroep. Interactief met slicers (jaar, categorie, land) en drill-down per cursus.</w:t>
-      </w:r>
-    </w:p>
-    <w:p>
-      <w:pPr>
-        <w:spacing w:after="160"/>
-      </w:pPr>
-      <w:r>
-        <w:rPr>
-          <w:rFonts w:ascii="Arial" w:cs="Arial" w:eastAsia="Arial" w:hAnsi="Arial"/>
-          <w:sz w:val="24"/>
-          <w:szCs w:val="24"/>
-        </w:rPr>
-        <w:t xml:space="preserve">Daarnaast kan een pagina 'Pijplijnkwaliteit' worden gemaakt op basis van het logbestand, om aantallen geladen rijen en eventuele fouten per run te tonen.</w:t>
-      </w:r>
-    </w:p>
-    <w:p>
-      <w:pPr>
-        <w:pStyle w:val="Heading1"/>
-      </w:pPr>
-      <w:r>
-        <w:rPr>
-          <w:rFonts w:ascii="Arial" w:cs="Arial" w:eastAsia="Arial" w:hAnsi="Arial"/>
-          <w:b/>
-          <w:bCs/>
-          <w:sz w:val="24"/>
-          <w:szCs w:val="24"/>
-        </w:rPr>
-        <w:t xml:space="preserve">9. Conclusies</w:t>
-      </w:r>
-    </w:p>
-    <w:p>
-      <w:pPr>
-        <w:pStyle w:val="Heading2"/>
-      </w:pPr>
-      <w:r>
-        <w:rPr>
-          <w:rFonts w:ascii="Arial" w:cs="Arial" w:eastAsia="Arial" w:hAnsi="Arial"/>
-          <w:b/>
-          <w:bCs/>
-          <w:sz w:val="24"/>
-          <w:szCs w:val="24"/>
-        </w:rPr>
-        <w:t xml:space="preserve">9.1 Retouren (knelpunt 2)</w:t>
-      </w:r>
-    </w:p>
-    <w:p>
-      <w:pPr>
-        <w:spacing w:after="160"/>
-      </w:pPr>
-      <w:r>
-        <w:rPr>
-          <w:rFonts w:ascii="Arial" w:cs="Arial" w:eastAsia="Arial" w:hAnsi="Arial"/>
-          <w:sz w:val="24"/>
-          <w:szCs w:val="24"/>
-        </w:rPr>
-        <w:t xml:space="preserve">In totaal zijn er 690 retourregels, samen 13.964 stuks, goed voor circa € 1.179.859 gederfde omzet en € 348.281 gederfde marge. Op het totale verkochte volume (ruim 2,1 miljoen stuks) is het retourpercentage laag (circa 0,7%), maar de financiële impact is fors.</w:t>
+        <w:t xml:space="preserve">Aantal deelnames per cursus en per medewerker </w:t>
+      </w:r>
+      <w:r>
+        <w:rPr>
+          <w:rFonts w:ascii="Arial" w:cs="Arial" w:eastAsia="Arial" w:hAnsi="Arial"/>
+          <w:sz w:val="24"/>
+          <w:szCs w:val="24"/>
+        </w:rPr>
+        <w:t xml:space="preserve">– geeft inzicht in de spreiding van trainingen.</w:t>
       </w:r>
     </w:p>
     <w:p>
@@ -4115,15 +4514,15 @@
           <w:sz w:val="24"/>
           <w:szCs w:val="24"/>
         </w:rPr>
-        <w:t xml:space="preserve">Oorzaken: </w:t>
-      </w:r>
-      <w:r>
-        <w:rPr>
-          <w:rFonts w:ascii="Arial" w:cs="Arial" w:eastAsia="Arial" w:hAnsi="Arial"/>
-          <w:sz w:val="24"/>
-          <w:szCs w:val="24"/>
-        </w:rPr>
-        <w:t xml:space="preserve">de categorie Kwaliteit is veruit de grootste kostenpost (≈ € 590k), gevolgd door Klantkeuze (≈ € 315k) en Logistiek (≈ € 275k). 'Unsatisfactory product' en 'Defective product' verdienen prioriteit in kwaliteitsbeleid.</w:t>
+        <w:t xml:space="preserve">(Aangenomen) cursuskosten per categorie </w:t>
+      </w:r>
+      <w:r>
+        <w:rPr>
+          <w:rFonts w:ascii="Arial" w:cs="Arial" w:eastAsia="Arial" w:hAnsi="Arial"/>
+          <w:sz w:val="24"/>
+          <w:szCs w:val="24"/>
+        </w:rPr>
+        <w:t xml:space="preserve">– maakt de investering in opleiding zichtbaar.</w:t>
       </w:r>
     </w:p>
     <w:p>
@@ -4143,15 +4542,15 @@
           <w:sz w:val="24"/>
           <w:szCs w:val="24"/>
         </w:rPr>
-        <w:t xml:space="preserve">Producten: </w:t>
-      </w:r>
-      <w:r>
-        <w:rPr>
-          <w:rFonts w:ascii="Arial" w:cs="Arial" w:eastAsia="Arial" w:hAnsi="Arial"/>
-          <w:sz w:val="24"/>
-          <w:szCs w:val="24"/>
-        </w:rPr>
-        <w:t xml:space="preserve">vooral Camping Equipment scoort hoog op retourpercentage; de EverGlow Lamp staat bovenaan (≈ 2,46%). Dit zijn logische kandidaten voor productverbetering of duidelijkere productinformatie.</w:t>
+        <w:t xml:space="preserve">Gemiddelde tevredenheid per jaar </w:t>
+      </w:r>
+      <w:r>
+        <w:rPr>
+          <w:rFonts w:ascii="Arial" w:cs="Arial" w:eastAsia="Arial" w:hAnsi="Arial"/>
+          <w:sz w:val="24"/>
+          <w:szCs w:val="24"/>
+        </w:rPr>
+        <w:t xml:space="preserve">– volgt de ontwikkeling van medewerkertevredenheid.</w:t>
       </w:r>
     </w:p>
     <w:p>
@@ -4171,30 +4570,30 @@
           <w:sz w:val="24"/>
           <w:szCs w:val="24"/>
         </w:rPr>
-        <w:t xml:space="preserve">Regio: </w:t>
-      </w:r>
-      <w:r>
-        <w:rPr>
-          <w:rFonts w:ascii="Arial" w:cs="Arial" w:eastAsia="Arial" w:hAnsi="Arial"/>
-          <w:sz w:val="24"/>
-          <w:szCs w:val="24"/>
-        </w:rPr>
-        <w:t xml:space="preserve">Canada en de Verenigde Staten kennen de hoogste retourwaarde; gericht logistiek/kwaliteitsonderzoek per regio kan lonen.</w:t>
-      </w:r>
-    </w:p>
-    <w:p>
-      <w:pPr>
-        <w:pStyle w:val="Heading2"/>
-      </w:pPr>
-      <w:r>
-        <w:rPr>
-          <w:rFonts w:ascii="Arial" w:cs="Arial" w:eastAsia="Arial" w:hAnsi="Arial"/>
-          <w:b/>
-          <w:bCs/>
-          <w:sz w:val="24"/>
-          <w:szCs w:val="24"/>
-        </w:rPr>
-        <w:t xml:space="preserve">9.2 Cursussen en tevredenheid (knelpunt 4)</w:t>
+        <w:t xml:space="preserve">Tevredenheid naar aantal gevolgde cursussen </w:t>
+      </w:r>
+      <w:r>
+        <w:rPr>
+          <w:rFonts w:ascii="Arial" w:cs="Arial" w:eastAsia="Arial" w:hAnsi="Arial"/>
+          <w:sz w:val="24"/>
+          <w:szCs w:val="24"/>
+        </w:rPr>
+        <w:t xml:space="preserve">– toont of training samenhangt met hogere tevredenheid (effectmeting).</w:t>
+      </w:r>
+    </w:p>
+    <w:p>
+      <w:pPr>
+        <w:pStyle w:val="Heading1"/>
+      </w:pPr>
+      <w:r>
+        <w:rPr>
+          <w:rFonts w:ascii="Arial" w:cs="Arial" w:eastAsia="Arial" w:hAnsi="Arial"/>
+          <w:b/>
+          <w:bCs/>
+          <w:sz w:val="24"/>
+          <w:szCs w:val="24"/>
+        </w:rPr>
+        <w:t xml:space="preserve">8. Power BI-analyses en dashboards</w:t>
       </w:r>
     </w:p>
     <w:p>
@@ -4207,58 +4606,7 @@
           <w:sz w:val="24"/>
           <w:szCs w:val="24"/>
         </w:rPr>
-        <w:t xml:space="preserve">Er zijn 402 cursusdeelnames geregistreerd, met een aangenomen totale opleidingskost van € 259.750. De meest gevolgde cursus is GO Communication, gevolgd door de Marketing-cursussen.</w:t>
-      </w:r>
-    </w:p>
-    <w:p>
-      <w:pPr>
-        <w:spacing w:after="160"/>
-      </w:pPr>
-      <w:r>
-        <w:rPr>
-          <w:rFonts w:ascii="Arial" w:cs="Arial" w:eastAsia="Arial" w:hAnsi="Arial"/>
-          <w:b/>
-          <w:bCs/>
-          <w:sz w:val="24"/>
-          <w:szCs w:val="24"/>
-        </w:rPr>
-        <w:t xml:space="preserve">Belangrijkste bevinding: </w:t>
-      </w:r>
-      <w:r>
-        <w:rPr>
-          <w:rFonts w:ascii="Arial" w:cs="Arial" w:eastAsia="Arial" w:hAnsi="Arial"/>
-          <w:sz w:val="24"/>
-          <w:szCs w:val="24"/>
-        </w:rPr>
-        <w:t xml:space="preserve">er is een duidelijk positief verband tussen het aantal gevolgde cursussen en de medewerkertevredenheid. Medewerkers zonder cursus scoren gemiddeld 2,93; met 1–3 cursussen 3,48; en met 4 of meer cursussen 3,60. Investeren in opleiding lijkt dus samen te gaan met hogere tevredenheid.</w:t>
-      </w:r>
-    </w:p>
-    <w:p>
-      <w:pPr>
-        <w:spacing w:after="160"/>
-      </w:pPr>
-      <w:r>
-        <w:rPr>
-          <w:rFonts w:ascii="Arial" w:cs="Arial" w:eastAsia="Arial" w:hAnsi="Arial"/>
-          <w:sz w:val="24"/>
-          <w:szCs w:val="24"/>
-        </w:rPr>
-        <w:t xml:space="preserve">De gemiddelde tevredenheid per jaar schommelt licht rond de 3,5 (2004: 3,57; 2005: 3,43; 2006: 3,65).</w:t>
-      </w:r>
-    </w:p>
-    <w:p>
-      <w:pPr>
-        <w:pStyle w:val="Heading1"/>
-      </w:pPr>
-      <w:r>
-        <w:rPr>
-          <w:rFonts w:ascii="Arial" w:cs="Arial" w:eastAsia="Arial" w:hAnsi="Arial"/>
-          <w:b/>
-          <w:bCs/>
-          <w:sz w:val="24"/>
-          <w:szCs w:val="24"/>
-        </w:rPr>
-        <w:t xml:space="preserve">10. Kanttekeningen en aannames</w:t>
+        <w:t xml:space="preserve">Omdat Power BI SQLite lastig leest, exporteert de notebook alle benodigde tabellen naar CSV (map powerbi_exports). Het volledige bouwplan met relaties en kant-en-klare DAX-measures staat in PowerBI_build_gids.md. Er zijn twee dashboardpagina's:</w:t>
       </w:r>
     </w:p>
     <w:p>
@@ -4278,15 +4626,15 @@
           <w:sz w:val="24"/>
           <w:szCs w:val="24"/>
         </w:rPr>
-        <w:t xml:space="preserve">Cursuskosten: </w:t>
-      </w:r>
-      <w:r>
-        <w:rPr>
-          <w:rFonts w:ascii="Arial" w:cs="Arial" w:eastAsia="Arial" w:hAnsi="Arial"/>
-          <w:sz w:val="24"/>
-          <w:szCs w:val="24"/>
-        </w:rPr>
-        <w:t xml:space="preserve">de bron bevat géén kosten per cursus. standard_cost is een gedocumenteerde aanname per categorie (€ 250 t/m € 1.000). De kosten-KPI's zijn daarmee indicatief.</w:t>
+        <w:t xml:space="preserve">Pagina 'Retouren': </w:t>
+      </w:r>
+      <w:r>
+        <w:rPr>
+          <w:rFonts w:ascii="Arial" w:cs="Arial" w:eastAsia="Arial" w:hAnsi="Arial"/>
+          <w:sz w:val="24"/>
+          <w:szCs w:val="24"/>
+        </w:rPr>
+        <w:t xml:space="preserve">KPI-kaarten (retourwaarde, gederfde marge, retourpercentage), staafdiagram per retourreden/-categorie, kaart per regio, tabel met top-producten en een trendlijn. Interactief met slicers (jaar, land, categorie, productlijn) en drill-down product en regio.</w:t>
       </w:r>
     </w:p>
     <w:p>
@@ -4306,15 +4654,71 @@
           <w:sz w:val="24"/>
           <w:szCs w:val="24"/>
         </w:rPr>
-        <w:t xml:space="preserve">Periode: </w:t>
-      </w:r>
-      <w:r>
-        <w:rPr>
-          <w:rFonts w:ascii="Arial" w:cs="Arial" w:eastAsia="Arial" w:hAnsi="Arial"/>
-          <w:sz w:val="24"/>
-          <w:szCs w:val="24"/>
-        </w:rPr>
-        <w:t xml:space="preserve">training- en tevredenheidsdata loopt 2004–2006, terwijl de verkoopdata 2023–2025 is. Een direct verband 'training → verkoop in hetzelfde jaar' is daarom niet te leggen. Het verband training ↔ tevredenheid (beide 2004–2006) is wél zuiver te analyseren.</w:t>
+        <w:t xml:space="preserve">Pagina 'Cursussen &amp; tevredenheid': </w:t>
+      </w:r>
+      <w:r>
+        <w:rPr>
+          <w:rFonts w:ascii="Arial" w:cs="Arial" w:eastAsia="Arial" w:hAnsi="Arial"/>
+          <w:sz w:val="24"/>
+          <w:szCs w:val="24"/>
+        </w:rPr>
+        <w:t xml:space="preserve">KPI-kaarten (deelnames, kosten, gemiddelde tevredenheid), deelname per cursus, kosten per categorie, tevredenheid per jaar en tevredenheid per trainingsgroep. Interactief met slicers (jaar, categorie, land) en drill-down per cursus.</w:t>
+      </w:r>
+    </w:p>
+    <w:p>
+      <w:pPr>
+        <w:spacing w:after="160"/>
+      </w:pPr>
+      <w:r>
+        <w:rPr>
+          <w:rFonts w:ascii="Arial" w:cs="Arial" w:eastAsia="Arial" w:hAnsi="Arial"/>
+          <w:sz w:val="24"/>
+          <w:szCs w:val="24"/>
+        </w:rPr>
+        <w:t xml:space="preserve">Daarnaast kan een pagina 'Pijplijnkwaliteit' worden gemaakt op basis van het logbestand, om aantallen geladen rijen en eventuele fouten per run te tonen.</w:t>
+      </w:r>
+    </w:p>
+    <w:p>
+      <w:pPr>
+        <w:pStyle w:val="Heading1"/>
+      </w:pPr>
+      <w:r>
+        <w:rPr>
+          <w:rFonts w:ascii="Arial" w:cs="Arial" w:eastAsia="Arial" w:hAnsi="Arial"/>
+          <w:b/>
+          <w:bCs/>
+          <w:sz w:val="24"/>
+          <w:szCs w:val="24"/>
+        </w:rPr>
+        <w:t xml:space="preserve">9. Conclusies</w:t>
+      </w:r>
+    </w:p>
+    <w:p>
+      <w:pPr>
+        <w:pStyle w:val="Heading2"/>
+      </w:pPr>
+      <w:r>
+        <w:rPr>
+          <w:rFonts w:ascii="Arial" w:cs="Arial" w:eastAsia="Arial" w:hAnsi="Arial"/>
+          <w:b/>
+          <w:bCs/>
+          <w:sz w:val="24"/>
+          <w:szCs w:val="24"/>
+        </w:rPr>
+        <w:t xml:space="preserve">9.1 Retouren (knelpunt 2)</w:t>
+      </w:r>
+    </w:p>
+    <w:p>
+      <w:pPr>
+        <w:spacing w:after="160"/>
+      </w:pPr>
+      <w:r>
+        <w:rPr>
+          <w:rFonts w:ascii="Arial" w:cs="Arial" w:eastAsia="Arial" w:hAnsi="Arial"/>
+          <w:sz w:val="24"/>
+          <w:szCs w:val="24"/>
+        </w:rPr>
+        <w:t xml:space="preserve">In totaal zijn er 690 retourregels, samen 13.964 stuks, goed voor circa € 1.179.859 gederfde omzet en € 348.281 gederfde marge. Op het totale verkochte volume (ruim 2,1 miljoen stuks) is het retourpercentage laag (circa 0,7%), maar de financiële impact is fors.</w:t>
       </w:r>
     </w:p>
     <w:p>
@@ -4334,30 +4738,15 @@
           <w:sz w:val="24"/>
           <w:szCs w:val="24"/>
         </w:rPr>
-        <w:t xml:space="preserve">Medewerkers zonder verkooprol: </w:t>
-      </w:r>
-      <w:r>
-        <w:rPr>
-          <w:rFonts w:ascii="Arial" w:cs="Arial" w:eastAsia="Arial" w:hAnsi="Arial"/>
-          <w:sz w:val="24"/>
-          <w:szCs w:val="24"/>
-        </w:rPr>
-        <w:t xml:space="preserve">enkele trainingsregels horen bij medewerkers die niet in de sales-dimensie voorkomen; deze krijgen een lege medewerkersleutel en zijn in het log geregistreerd.</w:t>
-      </w:r>
-    </w:p>
-    <w:p>
-      <w:pPr>
-        <w:pStyle w:val="Heading1"/>
-      </w:pPr>
-      <w:r>
-        <w:rPr>
-          <w:rFonts w:ascii="Arial" w:cs="Arial" w:eastAsia="Arial" w:hAnsi="Arial"/>
-          <w:b/>
-          <w:bCs/>
-          <w:sz w:val="24"/>
-          <w:szCs w:val="24"/>
-        </w:rPr>
-        <w:t xml:space="preserve">11. Bijlage: opgeleverde bestanden</w:t>
+        <w:t xml:space="preserve">Oorzaken: </w:t>
+      </w:r>
+      <w:r>
+        <w:rPr>
+          <w:rFonts w:ascii="Arial" w:cs="Arial" w:eastAsia="Arial" w:hAnsi="Arial"/>
+          <w:sz w:val="24"/>
+          <w:szCs w:val="24"/>
+        </w:rPr>
+        <w:t xml:space="preserve">de categorie Kwaliteit is veruit de grootste kostenpost (≈ € 590k), gevolgd door Klantkeuze (≈ € 315k) en Logistiek (≈ € 275k). 'Unsatisfactory product' en 'Defective product' verdienen prioriteit in kwaliteitsbeleid.</w:t>
       </w:r>
     </w:p>
     <w:p>
@@ -4372,10 +4761,20 @@
       <w:r>
         <w:rPr>
           <w:rFonts w:ascii="Arial" w:cs="Arial" w:eastAsia="Arial" w:hAnsi="Arial"/>
-          <w:sz w:val="24"/>
-          <w:szCs w:val="24"/>
-        </w:rPr>
-        <w:t xml:space="preserve">GO_DWH_Retouren_Cursussen_Notebook.ipynb – de ETL-notebook (één knop)</w:t>
+          <w:b/>
+          <w:bCs/>
+          <w:sz w:val="24"/>
+          <w:szCs w:val="24"/>
+        </w:rPr>
+        <w:t xml:space="preserve">Producten: </w:t>
+      </w:r>
+      <w:r>
+        <w:rPr>
+          <w:rFonts w:ascii="Arial" w:cs="Arial" w:eastAsia="Arial" w:hAnsi="Arial"/>
+          <w:sz w:val="24"/>
+          <w:szCs w:val="24"/>
+        </w:rPr>
+        <w:t xml:space="preserve">vooral Camping Equipment scoort hoog op retourpercentage; de EverGlow Lamp staat bovenaan (≈ 2,46%). Dit zijn logische kandidaten voor productverbetering of duidelijkere productinformatie.</w:t>
       </w:r>
     </w:p>
     <w:p>
@@ -4390,10 +4789,99 @@
       <w:r>
         <w:rPr>
           <w:rFonts w:ascii="Arial" w:cs="Arial" w:eastAsia="Arial" w:hAnsi="Arial"/>
-          <w:sz w:val="24"/>
-          <w:szCs w:val="24"/>
-        </w:rPr>
-        <w:t xml:space="preserve">SDM_nieuwe_klassen.sql – CREATE TABLEs en cross-database associaties</w:t>
+          <w:b/>
+          <w:bCs/>
+          <w:sz w:val="24"/>
+          <w:szCs w:val="24"/>
+        </w:rPr>
+        <w:t xml:space="preserve">Regio: </w:t>
+      </w:r>
+      <w:r>
+        <w:rPr>
+          <w:rFonts w:ascii="Arial" w:cs="Arial" w:eastAsia="Arial" w:hAnsi="Arial"/>
+          <w:sz w:val="24"/>
+          <w:szCs w:val="24"/>
+        </w:rPr>
+        <w:t xml:space="preserve">Canada en de Verenigde Staten kennen de hoogste retourwaarde; gericht logistiek/kwaliteitsonderzoek per regio kan lonen.</w:t>
+      </w:r>
+    </w:p>
+    <w:p>
+      <w:pPr>
+        <w:pStyle w:val="Heading2"/>
+      </w:pPr>
+      <w:r>
+        <w:rPr>
+          <w:rFonts w:ascii="Arial" w:cs="Arial" w:eastAsia="Arial" w:hAnsi="Arial"/>
+          <w:b/>
+          <w:bCs/>
+          <w:sz w:val="24"/>
+          <w:szCs w:val="24"/>
+        </w:rPr>
+        <w:t xml:space="preserve">9.2 Cursussen en tevredenheid (knelpunt 4)</w:t>
+      </w:r>
+    </w:p>
+    <w:p>
+      <w:pPr>
+        <w:spacing w:after="160"/>
+      </w:pPr>
+      <w:r>
+        <w:rPr>
+          <w:rFonts w:ascii="Arial" w:cs="Arial" w:eastAsia="Arial" w:hAnsi="Arial"/>
+          <w:sz w:val="24"/>
+          <w:szCs w:val="24"/>
+        </w:rPr>
+        <w:t xml:space="preserve">Er zijn 402 cursusdeelnames geregistreerd, met een aangenomen totale opleidingskost van € 259.750. De meest gevolgde cursus is GO Communication, gevolgd door de Marketing-cursussen.</w:t>
+      </w:r>
+    </w:p>
+    <w:p>
+      <w:pPr>
+        <w:spacing w:after="160"/>
+      </w:pPr>
+      <w:r>
+        <w:rPr>
+          <w:rFonts w:ascii="Arial" w:cs="Arial" w:eastAsia="Arial" w:hAnsi="Arial"/>
+          <w:b/>
+          <w:bCs/>
+          <w:sz w:val="24"/>
+          <w:szCs w:val="24"/>
+        </w:rPr>
+        <w:t xml:space="preserve">Belangrijkste bevinding: </w:t>
+      </w:r>
+      <w:r>
+        <w:rPr>
+          <w:rFonts w:ascii="Arial" w:cs="Arial" w:eastAsia="Arial" w:hAnsi="Arial"/>
+          <w:sz w:val="24"/>
+          <w:szCs w:val="24"/>
+        </w:rPr>
+        <w:t xml:space="preserve">er is een duidelijk positief verband tussen het aantal gevolgde cursussen en de medewerkertevredenheid. Medewerkers zonder cursus scoren gemiddeld 2,93; met 1–3 cursussen 3,48; en met 4 of meer cursussen 3,60. Investeren in opleiding lijkt dus samen te gaan met hogere tevredenheid.</w:t>
+      </w:r>
+    </w:p>
+    <w:p>
+      <w:pPr>
+        <w:spacing w:after="160"/>
+      </w:pPr>
+      <w:r>
+        <w:rPr>
+          <w:rFonts w:ascii="Arial" w:cs="Arial" w:eastAsia="Arial" w:hAnsi="Arial"/>
+          <w:sz w:val="24"/>
+          <w:szCs w:val="24"/>
+        </w:rPr>
+        <w:t xml:space="preserve">De gemiddelde tevredenheid per jaar schommelt licht rond de 3,5 (2004: 3,57; 2005: 3,43; 2006: 3,65).</w:t>
+      </w:r>
+    </w:p>
+    <w:p>
+      <w:pPr>
+        <w:pStyle w:val="Heading1"/>
+      </w:pPr>
+      <w:r>
+        <w:rPr>
+          <w:rFonts w:ascii="Arial" w:cs="Arial" w:eastAsia="Arial" w:hAnsi="Arial"/>
+          <w:b/>
+          <w:bCs/>
+          <w:sz w:val="24"/>
+          <w:szCs w:val="24"/>
+        </w:rPr>
+        <w:t xml:space="preserve">10. Kanttekeningen en aannames</w:t>
       </w:r>
     </w:p>
     <w:p>
@@ -4408,10 +4896,163 @@
       <w:r>
         <w:rPr>
           <w:rFonts w:ascii="Arial" w:cs="Arial" w:eastAsia="Arial" w:hAnsi="Arial"/>
-          <w:sz w:val="24"/>
-          <w:szCs w:val="24"/>
-        </w:rPr>
-        <w:t xml:space="preserve">sterschema_nieuw.png / .svg – het uitgebreide sterschema (Figuur 1)</w:t>
+          <w:b/>
+          <w:bCs/>
+          <w:sz w:val="24"/>
+          <w:szCs w:val="24"/>
+        </w:rPr>
+        <w:t xml:space="preserve">Cursuskosten: </w:t>
+      </w:r>
+      <w:r>
+        <w:rPr>
+          <w:rFonts w:ascii="Arial" w:cs="Arial" w:eastAsia="Arial" w:hAnsi="Arial"/>
+          <w:sz w:val="24"/>
+          <w:szCs w:val="24"/>
+        </w:rPr>
+        <w:t xml:space="preserve">de bron bevat géén kosten per cursus. standard_cost is een gedocumenteerde aanname per categorie (€ 250 t/m € 1.000). De kosten-KPI's zijn daarmee indicatief.</w:t>
+      </w:r>
+    </w:p>
+    <w:p>
+      <w:pPr>
+        <w:pStyle w:val="ListParagraph"/>
+        <w:numPr>
+          <w:ilvl w:val="0"/>
+          <w:numId w:val="2"/>
+        </w:numPr>
+        <w:spacing w:after="80"/>
+      </w:pPr>
+      <w:r>
+        <w:rPr>
+          <w:rFonts w:ascii="Arial" w:cs="Arial" w:eastAsia="Arial" w:hAnsi="Arial"/>
+          <w:b/>
+          <w:bCs/>
+          <w:sz w:val="24"/>
+          <w:szCs w:val="24"/>
+        </w:rPr>
+        <w:t xml:space="preserve">Periode: </w:t>
+      </w:r>
+      <w:r>
+        <w:rPr>
+          <w:rFonts w:ascii="Arial" w:cs="Arial" w:eastAsia="Arial" w:hAnsi="Arial"/>
+          <w:sz w:val="24"/>
+          <w:szCs w:val="24"/>
+        </w:rPr>
+        <w:t xml:space="preserve">training- en tevredenheidsdata loopt 2004–2006, terwijl de verkoopdata 2023–2025 is. Een direct verband 'training → verkoop in hetzelfde jaar' is daarom niet te leggen. Het verband training ↔ tevredenheid (beide 2004–2006) is wél zuiver te analyseren.</w:t>
+      </w:r>
+    </w:p>
+    <w:p>
+      <w:pPr>
+        <w:pStyle w:val="ListParagraph"/>
+        <w:numPr>
+          <w:ilvl w:val="0"/>
+          <w:numId w:val="2"/>
+        </w:numPr>
+        <w:spacing w:after="80"/>
+      </w:pPr>
+      <w:r>
+        <w:rPr>
+          <w:rFonts w:ascii="Arial" w:cs="Arial" w:eastAsia="Arial" w:hAnsi="Arial"/>
+          <w:b/>
+          <w:bCs/>
+          <w:sz w:val="24"/>
+          <w:szCs w:val="24"/>
+        </w:rPr>
+        <w:t xml:space="preserve">Medewerkers zonder verkooprol: </w:t>
+      </w:r>
+      <w:r>
+        <w:rPr>
+          <w:rFonts w:ascii="Arial" w:cs="Arial" w:eastAsia="Arial" w:hAnsi="Arial"/>
+          <w:sz w:val="24"/>
+          <w:szCs w:val="24"/>
+        </w:rPr>
+        <w:t xml:space="preserve">enkele trainingsregels horen bij medewerkers die niet in de sales-dimensie voorkomen; deze krijgen een lege medewerkersleutel en zijn in het log geregistreerd.</w:t>
+      </w:r>
+    </w:p>
+    <w:p>
+      <w:pPr>
+        <w:pStyle w:val="Heading1"/>
+      </w:pPr>
+      <w:r>
+        <w:rPr>
+          <w:rFonts w:ascii="Arial" w:cs="Arial" w:eastAsia="Arial" w:hAnsi="Arial"/>
+          <w:b/>
+          <w:bCs/>
+          <w:sz w:val="24"/>
+          <w:szCs w:val="24"/>
+        </w:rPr>
+        <w:t xml:space="preserve">11. Bijlage: opgeleverde bestanden</w:t>
+      </w:r>
+    </w:p>
+    <w:p>
+      <w:pPr>
+        <w:pStyle w:val="ListParagraph"/>
+        <w:numPr>
+          <w:ilvl w:val="0"/>
+          <w:numId w:val="2"/>
+        </w:numPr>
+        <w:spacing w:after="80"/>
+      </w:pPr>
+      <w:r>
+        <w:rPr>
+          <w:rFonts w:ascii="Arial" w:cs="Arial" w:eastAsia="Arial" w:hAnsi="Arial"/>
+          <w:sz w:val="24"/>
+          <w:szCs w:val="24"/>
+        </w:rPr>
+        <w:t xml:space="preserve">GO_DWH_Retouren_Cursussen_Notebook.ipynb – de ETL-notebook (één knop)</w:t>
+      </w:r>
+    </w:p>
+    <w:p>
+      <w:pPr>
+        <w:pStyle w:val="ListParagraph"/>
+        <w:numPr>
+          <w:ilvl w:val="0"/>
+          <w:numId w:val="2"/>
+        </w:numPr>
+        <w:spacing w:after="80"/>
+      </w:pPr>
+      <w:r>
+        <w:rPr>
+          <w:rFonts w:ascii="Arial" w:cs="Arial" w:eastAsia="Arial" w:hAnsi="Arial"/>
+          <w:sz w:val="24"/>
+          <w:szCs w:val="24"/>
+        </w:rPr>
+        <w:t xml:space="preserve">SDM_nieuwe_klassen.sql – CREATE TABLEs en cross-database associaties</w:t>
+      </w:r>
+    </w:p>
+    <w:p>
+      <w:pPr>
+        <w:pStyle w:val="ListParagraph"/>
+        <w:numPr>
+          <w:ilvl w:val="0"/>
+          <w:numId w:val="2"/>
+        </w:numPr>
+        <w:spacing w:after="80"/>
+      </w:pPr>
+      <w:r>
+        <w:rPr>
+          <w:rFonts w:ascii="Arial" w:cs="Arial" w:eastAsia="Arial" w:hAnsi="Arial"/>
+          <w:sz w:val="24"/>
+          <w:szCs w:val="24"/>
+        </w:rPr>
+        <w:t xml:space="preserve">sterschema_geintegreerd.png / .svg – geïntegreerd sterschema (Figuur 1)</w:t>
+      </w:r>
+    </w:p>
+    <w:p>
+      <w:pPr>
+        <w:pStyle w:val="ListParagraph"/>
+        <w:numPr>
+          <w:ilvl w:val="0"/>
+          <w:numId w:val="2"/>
+        </w:numPr>
+        <w:spacing w:after="80"/>
+      </w:pPr>
+      <w:r>
+        <w:rPr>
+          <w:rFonts w:ascii="Arial" w:cs="Arial" w:eastAsia="Arial" w:hAnsi="Arial"/>
+          <w:sz w:val="24"/>
+          <w:szCs w:val="24"/>
+        </w:rPr>
+        <w:t xml:space="preserve">etl_schema_nieuw.png / .svg – het ETL-schema per klasse (Figuur 2)</w:t>
       </w:r>
     </w:p>
     <w:p>

</xml_diff>